<commit_message>
added more descriptive statistics
</commit_message>
<xml_diff>
--- a/thesis2/Draft-Thesis.docx
+++ b/thesis2/Draft-Thesis.docx
@@ -41,7 +41,7 @@
           <w:pgNumType w:start="1"/>
         </w:sectPr>
       </w:pPr>
-      <w:bookmarkStart w:colFirst="0" w:colLast="0" w:name="_z65zo811j5e0" w:id="0"/>
+      <w:bookmarkStart w:colFirst="0" w:colLast="0" w:name="_u6o63hj25vbu" w:id="0"/>
       <w:bookmarkEnd w:id="0"/>
       <w:r>
         <w:rPr>
@@ -665,7 +665,7 @@
     </w:p>
     <w:sdt>
       <w:sdtPr>
-        <w:id w:val="132226756"/>
+        <w:id w:val="1316435545"/>
         <w:docPartObj>
           <w:docPartGallery w:val="Table of Contents"/>
           <w:docPartUnique w:val="1"/>
@@ -6669,7 +6669,7 @@
       <w:pPr>
         <w:numPr>
           <w:ilvl w:val="0"/>
-          <w:numId w:val="14"/>
+          <w:numId w:val="15"/>
         </w:numPr>
         <w:spacing w:after="0" w:afterAutospacing="0" w:before="240" w:line="480" w:lineRule="auto"/>
         <w:ind w:left="720" w:hanging="360"/>
@@ -6685,7 +6685,7 @@
       <w:pPr>
         <w:numPr>
           <w:ilvl w:val="0"/>
-          <w:numId w:val="14"/>
+          <w:numId w:val="15"/>
         </w:numPr>
         <w:spacing w:after="0" w:afterAutospacing="0" w:before="0" w:beforeAutospacing="0" w:line="480" w:lineRule="auto"/>
         <w:ind w:left="720" w:hanging="360"/>
@@ -6713,7 +6713,7 @@
       <w:pPr>
         <w:numPr>
           <w:ilvl w:val="0"/>
-          <w:numId w:val="14"/>
+          <w:numId w:val="15"/>
         </w:numPr>
         <w:spacing w:after="240" w:before="0" w:beforeAutospacing="0" w:line="480" w:lineRule="auto"/>
         <w:ind w:left="720" w:hanging="360"/>
@@ -10325,12 +10325,12 @@
           <wp:inline distB="114300" distT="114300" distL="114300" distR="114300">
             <wp:extent cx="5943600" cy="3009900"/>
             <wp:effectExtent b="0" l="0" r="0" t="0"/>
-            <wp:docPr descr="A diagram of the study design" id="2" name="image2.png"/>
+            <wp:docPr descr="A diagram of the study design" id="14" name="image17.png"/>
             <a:graphic>
               <a:graphicData uri="http://schemas.openxmlformats.org/drawingml/2006/picture">
                 <pic:pic>
                   <pic:nvPicPr>
-                    <pic:cNvPr descr="A diagram of the study design" id="0" name="image2.png"/>
+                    <pic:cNvPr descr="A diagram of the study design" id="0" name="image17.png"/>
                     <pic:cNvPicPr preferRelativeResize="0"/>
                   </pic:nvPicPr>
                   <pic:blipFill>
@@ -11706,12 +11706,12 @@
           <wp:inline distB="114300" distT="114300" distL="114300" distR="114300">
             <wp:extent cx="4657725" cy="5133975"/>
             <wp:effectExtent b="0" l="0" r="0" t="0"/>
-            <wp:docPr id="8" name="image3.png"/>
+            <wp:docPr id="20" name="image13.png"/>
             <a:graphic>
               <a:graphicData uri="http://schemas.openxmlformats.org/drawingml/2006/picture">
                 <pic:pic>
                   <pic:nvPicPr>
-                    <pic:cNvPr id="0" name="image3.png"/>
+                    <pic:cNvPr id="0" name="image13.png"/>
                     <pic:cNvPicPr preferRelativeResize="0"/>
                   </pic:nvPicPr>
                   <pic:blipFill>
@@ -11771,12 +11771,12 @@
           <wp:inline distB="114300" distT="114300" distL="114300" distR="114300">
             <wp:extent cx="5943600" cy="3657600"/>
             <wp:effectExtent b="0" l="0" r="0" t="0"/>
-            <wp:docPr id="16" name="image14.png"/>
+            <wp:docPr id="12" name="image12.png"/>
             <a:graphic>
               <a:graphicData uri="http://schemas.openxmlformats.org/drawingml/2006/picture">
                 <pic:pic>
                   <pic:nvPicPr>
-                    <pic:cNvPr id="0" name="image14.png"/>
+                    <pic:cNvPr id="0" name="image12.png"/>
                     <pic:cNvPicPr preferRelativeResize="0"/>
                   </pic:nvPicPr>
                   <pic:blipFill>
@@ -11980,12 +11980,12 @@
           <wp:inline distB="114300" distT="114300" distL="114300" distR="114300">
             <wp:extent cx="5943600" cy="3276600"/>
             <wp:effectExtent b="0" l="0" r="0" t="0"/>
-            <wp:docPr id="9" name="image5.png"/>
+            <wp:docPr id="13" name="image18.png"/>
             <a:graphic>
               <a:graphicData uri="http://schemas.openxmlformats.org/drawingml/2006/picture">
                 <pic:pic>
                   <pic:nvPicPr>
-                    <pic:cNvPr id="0" name="image5.png"/>
+                    <pic:cNvPr id="0" name="image18.png"/>
                     <pic:cNvPicPr preferRelativeResize="0"/>
                   </pic:nvPicPr>
                   <pic:blipFill>
@@ -12070,12 +12070,12 @@
           <wp:inline distB="114300" distT="114300" distL="114300" distR="114300">
             <wp:extent cx="5943600" cy="2794000"/>
             <wp:effectExtent b="0" l="0" r="0" t="0"/>
-            <wp:docPr id="17" name="image12.png"/>
+            <wp:docPr id="16" name="image6.png"/>
             <a:graphic>
               <a:graphicData uri="http://schemas.openxmlformats.org/drawingml/2006/picture">
                 <pic:pic>
                   <pic:nvPicPr>
-                    <pic:cNvPr id="0" name="image12.png"/>
+                    <pic:cNvPr id="0" name="image6.png"/>
                     <pic:cNvPicPr preferRelativeResize="0"/>
                   </pic:nvPicPr>
                   <pic:blipFill>
@@ -12242,12 +12242,12 @@
           <wp:inline distB="114300" distT="114300" distL="114300" distR="114300">
             <wp:extent cx="5943600" cy="2895600"/>
             <wp:effectExtent b="0" l="0" r="0" t="0"/>
-            <wp:docPr id="6" name="image7.png"/>
+            <wp:docPr id="5" name="image14.png"/>
             <a:graphic>
               <a:graphicData uri="http://schemas.openxmlformats.org/drawingml/2006/picture">
                 <pic:pic>
                   <pic:nvPicPr>
-                    <pic:cNvPr id="0" name="image7.png"/>
+                    <pic:cNvPr id="0" name="image14.png"/>
                     <pic:cNvPicPr preferRelativeResize="0"/>
                   </pic:nvPicPr>
                   <pic:blipFill>
@@ -12681,12 +12681,12 @@
           <wp:inline distB="114300" distT="114300" distL="114300" distR="114300">
             <wp:extent cx="5943600" cy="1828800"/>
             <wp:effectExtent b="0" l="0" r="0" t="0"/>
-            <wp:docPr id="3" name="image1.png"/>
+            <wp:docPr id="3" name="image9.png"/>
             <a:graphic>
               <a:graphicData uri="http://schemas.openxmlformats.org/drawingml/2006/picture">
                 <pic:pic>
                   <pic:nvPicPr>
-                    <pic:cNvPr id="0" name="image1.png"/>
+                    <pic:cNvPr id="0" name="image9.png"/>
                     <pic:cNvPicPr preferRelativeResize="0"/>
                   </pic:nvPicPr>
                   <pic:blipFill>
@@ -12802,12 +12802,12 @@
           <wp:inline distB="114300" distT="114300" distL="114300" distR="114300">
             <wp:extent cx="5943600" cy="1231900"/>
             <wp:effectExtent b="0" l="0" r="0" t="0"/>
-            <wp:docPr descr="A black screen with white text&#10;&#10;AI-generated content may be incorrect." id="19" name="image15.jpg"/>
+            <wp:docPr descr="A black screen with white text&#10;&#10;AI-generated content may be incorrect." id="10" name="image5.jpg"/>
             <a:graphic>
               <a:graphicData uri="http://schemas.openxmlformats.org/drawingml/2006/picture">
                 <pic:pic>
                   <pic:nvPicPr>
-                    <pic:cNvPr descr="A black screen with white text&#10;&#10;AI-generated content may be incorrect." id="0" name="image15.jpg"/>
+                    <pic:cNvPr descr="A black screen with white text&#10;&#10;AI-generated content may be incorrect." id="0" name="image5.jpg"/>
                     <pic:cNvPicPr preferRelativeResize="0"/>
                   </pic:nvPicPr>
                   <pic:blipFill>
@@ -12877,12 +12877,12 @@
           <wp:inline distB="114300" distT="114300" distL="114300" distR="114300">
             <wp:extent cx="5943600" cy="1244600"/>
             <wp:effectExtent b="0" l="0" r="0" t="0"/>
-            <wp:docPr descr="A black background with white text&#10;&#10;AI-generated content may be incorrect." id="23" name="image22.jpg"/>
+            <wp:docPr descr="A black background with white text&#10;&#10;AI-generated content may be incorrect." id="1" name="image4.jpg"/>
             <a:graphic>
               <a:graphicData uri="http://schemas.openxmlformats.org/drawingml/2006/picture">
                 <pic:pic>
                   <pic:nvPicPr>
-                    <pic:cNvPr descr="A black background with white text&#10;&#10;AI-generated content may be incorrect." id="0" name="image22.jpg"/>
+                    <pic:cNvPr descr="A black background with white text&#10;&#10;AI-generated content may be incorrect." id="0" name="image4.jpg"/>
                     <pic:cNvPicPr preferRelativeResize="0"/>
                   </pic:nvPicPr>
                   <pic:blipFill>
@@ -16945,12 +16945,12 @@
           <wp:inline distB="114300" distT="114300" distL="114300" distR="114300">
             <wp:extent cx="4786313" cy="3566272"/>
             <wp:effectExtent b="0" l="0" r="0" t="0"/>
-            <wp:docPr id="20" name="image18.png"/>
+            <wp:docPr id="22" name="image23.png"/>
             <a:graphic>
               <a:graphicData uri="http://schemas.openxmlformats.org/drawingml/2006/picture">
                 <pic:pic>
                   <pic:nvPicPr>
-                    <pic:cNvPr id="0" name="image18.png"/>
+                    <pic:cNvPr id="0" name="image23.png"/>
                     <pic:cNvPicPr preferRelativeResize="0"/>
                   </pic:nvPicPr>
                   <pic:blipFill>
@@ -17145,7 +17145,7 @@
       <w:pPr>
         <w:numPr>
           <w:ilvl w:val="0"/>
-          <w:numId w:val="10"/>
+          <w:numId w:val="11"/>
         </w:numPr>
         <w:spacing w:after="0" w:afterAutospacing="0" w:before="240" w:line="480" w:lineRule="auto"/>
         <w:ind w:left="720" w:hanging="360"/>
@@ -17188,7 +17188,7 @@
       <w:pPr>
         <w:numPr>
           <w:ilvl w:val="0"/>
-          <w:numId w:val="10"/>
+          <w:numId w:val="11"/>
         </w:numPr>
         <w:spacing w:after="240" w:before="0" w:beforeAutospacing="0" w:line="480" w:lineRule="auto"/>
         <w:ind w:left="720" w:hanging="360"/>
@@ -18193,6 +18193,178 @@
     </w:p>
     <w:p>
       <w:pPr>
+        <w:spacing w:after="240" w:before="240" w:line="480" w:lineRule="auto"/>
+        <w:rPr>
+          <w:b w:val="1"/>
+          <w:bCs w:val="1"/>
+        </w:rPr>
+      </w:pPr>
+      <w:r>
+        <w:rPr>
+          <w:b w:val="1"/>
+          <w:bCs w:val="1"/>
+          <w:rtl w:val="0"/>
+        </w:rPr>
+        <w:t xml:space="preserve">Criteria for Hypothesis Testing</w:t>
+      </w:r>
+    </w:p>
+    <w:p>
+      <w:pPr>
+        <w:spacing w:after="240" w:before="240" w:line="480" w:lineRule="auto"/>
+        <w:rPr/>
+      </w:pPr>
+      <w:r>
+        <w:rPr>
+          <w:rtl w:val="0"/>
+        </w:rPr>
+        <w:t xml:space="preserve">Statistical significance was defined at the 𝛼 = .05 level.</w:t>
+      </w:r>
+    </w:p>
+    <w:p>
+      <w:pPr>
+        <w:spacing w:after="240" w:before="240" w:line="480" w:lineRule="auto"/>
+        <w:rPr/>
+      </w:pPr>
+      <w:r>
+        <w:rPr>
+          <w:rtl w:val="0"/>
+        </w:rPr>
+        <w:t xml:space="preserve">Statistical significance was defined at the </w:t>
+      </w:r>
+      <w:r>
+        <w:rPr>
+          <w:rFonts w:ascii="Times New Roman" w:cs="Times New Roman" w:eastAsia="Times New Roman" w:hAnsi="Times New Roman"/>
+          <w:rtl w:val="0"/>
+        </w:rPr>
+        <w:t xml:space="preserve">𝛼</w:t>
+      </w:r>
+      <w:r>
+        <w:rPr>
+          <w:rtl w:val="0"/>
+        </w:rPr>
+        <w:t xml:space="preserve"> = .05 level.</w:t>
+      </w:r>
+    </w:p>
+    <w:p>
+      <w:pPr>
+        <w:numPr>
+          <w:ilvl w:val="0"/>
+          <w:numId w:val="8"/>
+        </w:numPr>
+        <w:spacing w:after="240" w:line="480" w:lineRule="auto"/>
+        <w:ind w:left="720" w:hanging="360"/>
+      </w:pPr>
+      <w:r>
+        <w:rPr>
+          <w:b w:val="1"/>
+          <w:bCs w:val="1"/>
+          <w:i w:val="1"/>
+          <w:iCs w:val="1"/>
+          <w:rtl w:val="0"/>
+        </w:rPr>
+        <w:t xml:space="preserve">H</w:t>
+      </w:r>
+      <w:r>
+        <w:rPr>
+          <w:b w:val="1"/>
+          <w:bCs w:val="1"/>
+          <w:i w:val="1"/>
+          <w:iCs w:val="1"/>
+          <w:vertAlign w:val="subscript"/>
+          <w:rtl w:val="0"/>
+        </w:rPr>
+        <w:t xml:space="preserve">2</w:t>
+      </w:r>
+      <w:r>
+        <w:rPr>
+          <w:b w:val="1"/>
+          <w:bCs w:val="1"/>
+          <w:vertAlign w:val="subscript"/>
+          <w:rtl w:val="0"/>
+        </w:rPr>
+        <w:t xml:space="preserve"> </w:t>
+      </w:r>
+      <w:r>
+        <w:rPr>
+          <w:b w:val="1"/>
+          <w:bCs w:val="1"/>
+          <w:rtl w:val="0"/>
+        </w:rPr>
+        <w:t xml:space="preserve">Support:</w:t>
+      </w:r>
+      <w:r>
+        <w:rPr>
+          <w:rtl w:val="0"/>
+        </w:rPr>
+        <w:t xml:space="preserve"> A </w:t>
+      </w:r>
+      <w:r>
+        <w:rPr>
+          <w:i w:val="1"/>
+          <w:iCs w:val="1"/>
+          <w:rtl w:val="0"/>
+        </w:rPr>
+        <w:t xml:space="preserve">p</w:t>
+      </w:r>
+      <w:r>
+        <w:rPr>
+          <w:rtl w:val="0"/>
+        </w:rPr>
+        <w:t xml:space="preserve"> &lt; .05 for Model 1</w:t>
+      </w:r>
+    </w:p>
+    <w:p>
+      <w:pPr>
+        <w:spacing w:after="240" w:before="240" w:line="480" w:lineRule="auto"/>
+        <w:rPr>
+          <w:i w:val="1"/>
+          <w:iCs w:val="1"/>
+        </w:rPr>
+      </w:pPr>
+      <w:r>
+        <w:rPr>
+          <w:rtl w:val="0"/>
+        </w:rPr>
+        <w:t xml:space="preserve">The null hypothesis (</w:t>
+      </w:r>
+      <w:r>
+        <w:rPr>
+          <w:b w:val="1"/>
+          <w:bCs w:val="1"/>
+          <w:i w:val="1"/>
+          <w:iCs w:val="1"/>
+          <w:rtl w:val="0"/>
+        </w:rPr>
+        <w:t xml:space="preserve">H02</w:t>
+      </w:r>
+      <w:r>
+        <w:rPr>
+          <w:rtl w:val="0"/>
+        </w:rPr>
+        <w:t xml:space="preserve">) was rejected when </w:t>
+      </w:r>
+      <w:r>
+        <w:rPr>
+          <w:i w:val="1"/>
+          <w:iCs w:val="1"/>
+          <w:rtl w:val="0"/>
+        </w:rPr>
+        <w:t xml:space="preserve">p &gt;= .05.</w:t>
+      </w:r>
+    </w:p>
+    <w:p>
+      <w:pPr>
+        <w:spacing w:after="240" w:before="240" w:line="480" w:lineRule="auto"/>
+        <w:rPr/>
+      </w:pPr>
+      <w:r>
+        <w:rPr>
+          <w:rtl w:val="0"/>
+        </w:rPr>
+      </w:r>
+    </w:p>
+    <w:p>
+      <w:pPr>
         <w:pStyle w:val="Heading3"/>
         <w:spacing w:after="240" w:before="240" w:line="480" w:lineRule="auto"/>
         <w:rPr/>
@@ -18959,6 +19131,115 @@
     </w:p>
     <w:p>
       <w:pPr>
+        <w:pStyle w:val="Heading2"/>
+        <w:spacing w:after="240" w:before="240" w:line="480" w:lineRule="auto"/>
+        <w:rPr/>
+      </w:pPr>
+      <w:bookmarkStart w:colFirst="0" w:colLast="0" w:name="_3ssjort0rp03" w:id="60"/>
+      <w:bookmarkEnd w:id="60"/>
+      <w:r>
+        <w:rPr>
+          <w:rtl w:val="0"/>
+        </w:rPr>
+        <w:t xml:space="preserve">3.5 Summary</w:t>
+      </w:r>
+    </w:p>
+    <w:p>
+      <w:pPr>
+        <w:spacing w:after="240" w:before="240" w:line="480" w:lineRule="auto"/>
+        <w:rPr/>
+      </w:pPr>
+      <w:r>
+        <w:rPr>
+          <w:rtl w:val="0"/>
+        </w:rPr>
+        <w:t xml:space="preserve">This chapter detailed the research methodology employed to investigate the impact of LLMs on student learning performance and computational literacy. The study utilized a multi-method quantitative design centered on a six-week intervention within an introductory Python programming course (N=173, final sample n=121).</w:t>
+      </w:r>
+    </w:p>
+    <w:p>
+      <w:pPr>
+        <w:spacing w:after="240" w:before="240" w:line="480" w:lineRule="auto"/>
+        <w:rPr/>
+      </w:pPr>
+      <w:r>
+        <w:rPr>
+          <w:rtl w:val="0"/>
+        </w:rPr>
+        <w:t xml:space="preserve">To address the efficacy of context-aware AI, the research employed a randomized controlled trial where participants were randomly assigned to either a control group (T1) using a standard AI interface or a treatment group (T2) utilizing a context-aware interface that automatically injected assignment instructions into the chat. Data collection relied on four primary instruments, including chatbot trace data (D1), which consisted of logs of student-AI interactions generated by a self-hosted GPT-4o-mini application; computational thinking test (C1/C2), a psychometrically validated pre-test and post-test instrument used to measure gains in computational literacy; and midterm exam (E1), which served as a summative assessment of programming proficiency.</w:t>
+      </w:r>
+    </w:p>
+    <w:p>
+      <w:pPr>
+        <w:spacing w:after="240" w:before="240" w:line="480" w:lineRule="auto"/>
+        <w:rPr/>
+      </w:pPr>
+      <w:r>
+        <w:rPr>
+          <w:rtl w:val="0"/>
+        </w:rPr>
+        <w:t xml:space="preserve">A defining methodological feature was the categorical content analysis of 1,024 chat sessions from D1. Using a codebook grounded in help-seeking theory, sessions were classified as either Learning (adaptive help-seeking) or Task Completion (executive help-seeking). To ensure scalability and consistency, this classification was performed by the Claude-sonnet-4 LLM, which achieved the highest inter-coder reliability (𝛼 = .873) of models tested against a human baseline.</w:t>
+      </w:r>
+    </w:p>
+    <w:p>
+      <w:pPr>
+        <w:spacing w:after="240" w:before="240" w:line="480" w:lineRule="auto"/>
+        <w:rPr/>
+      </w:pPr>
+      <w:r>
+        <w:rPr>
+          <w:rtl w:val="0"/>
+        </w:rPr>
+        <w:t xml:space="preserve">The chapter concluded by outlining the statistical models used to test the research hypotheses:</w:t>
+      </w:r>
+    </w:p>
+    <w:p>
+      <w:pPr>
+        <w:spacing w:after="240" w:before="240" w:line="480" w:lineRule="auto"/>
+        <w:rPr/>
+      </w:pPr>
+      <w:r>
+        <w:rPr>
+          <w:rtl w:val="0"/>
+        </w:rPr>
+        <w:t xml:space="preserve">RQ1: Employed a Hierarchical linear regression to evaluate the unique predictive power of Learning vs. Task Completion behaviors on E1.</w:t>
+      </w:r>
+    </w:p>
+    <w:p>
+      <w:pPr>
+        <w:spacing w:after="240" w:before="240" w:line="480" w:lineRule="auto"/>
+        <w:rPr/>
+      </w:pPr>
+      <w:r>
+        <w:rPr>
+          <w:rtl w:val="0"/>
+        </w:rPr>
+        <w:t xml:space="preserve">RQ2: A multi-stage regression analysis (including mediation, moderation, and suppression checks) to isolate the conditional effects of the context-aware treatment, T2.</w:t>
+      </w:r>
+    </w:p>
+    <w:p>
+      <w:pPr>
+        <w:spacing w:after="240" w:before="240" w:line="480" w:lineRule="auto"/>
+        <w:rPr/>
+      </w:pPr>
+      <w:r>
+        <w:rPr>
+          <w:rtl w:val="0"/>
+        </w:rPr>
+        <w:t xml:space="preserve">RQ3: An Analysis of Covariance (ANCOVA) to measure shifts in computational literacy C2 while controlling for baseline ability, C1.</w:t>
+      </w:r>
+    </w:p>
+    <w:p>
+      <w:pPr>
+        <w:rPr/>
+      </w:pPr>
+      <w:r>
+        <w:rPr>
+          <w:rtl w:val="0"/>
+        </w:rPr>
+      </w:r>
+    </w:p>
+    <w:p>
+      <w:pPr>
         <w:pStyle w:val="Heading1"/>
         <w:spacing w:before="480" w:lineRule="auto"/>
         <w:rPr>
@@ -18968,8 +19249,8 @@
           <w:szCs w:val="46"/>
         </w:rPr>
       </w:pPr>
-      <w:bookmarkStart w:colFirst="0" w:colLast="0" w:name="_hnqlmvv1p96t" w:id="60"/>
-      <w:bookmarkEnd w:id="60"/>
+      <w:bookmarkStart w:colFirst="0" w:colLast="0" w:name="_hnqlmvv1p96t" w:id="61"/>
+      <w:bookmarkEnd w:id="61"/>
       <w:r>
         <w:rPr>
           <w:b w:val="1"/>
@@ -18987,8 +19268,8 @@
         <w:spacing w:after="240" w:before="240" w:line="480" w:lineRule="auto"/>
         <w:rPr/>
       </w:pPr>
-      <w:bookmarkStart w:colFirst="0" w:colLast="0" w:name="_7nyihjz3vmeo" w:id="61"/>
-      <w:bookmarkEnd w:id="61"/>
+      <w:bookmarkStart w:colFirst="0" w:colLast="0" w:name="_7nyihjz3vmeo" w:id="62"/>
+      <w:bookmarkEnd w:id="62"/>
       <w:r>
         <w:rPr>
           <w:rtl w:val="0"/>
@@ -19012,7 +19293,7 @@
       <w:pPr>
         <w:numPr>
           <w:ilvl w:val="0"/>
-          <w:numId w:val="8"/>
+          <w:numId w:val="9"/>
         </w:numPr>
         <w:spacing w:after="0" w:afterAutospacing="0" w:before="240" w:line="480" w:lineRule="auto"/>
         <w:ind w:left="720" w:hanging="360"/>
@@ -19048,7 +19329,7 @@
       <w:pPr>
         <w:numPr>
           <w:ilvl w:val="0"/>
-          <w:numId w:val="8"/>
+          <w:numId w:val="9"/>
         </w:numPr>
         <w:spacing w:after="0" w:afterAutospacing="0" w:before="0" w:beforeAutospacing="0" w:line="480" w:lineRule="auto"/>
         <w:ind w:left="720" w:hanging="360"/>
@@ -19072,7 +19353,7 @@
       <w:pPr>
         <w:numPr>
           <w:ilvl w:val="0"/>
-          <w:numId w:val="8"/>
+          <w:numId w:val="9"/>
         </w:numPr>
         <w:spacing w:after="240" w:before="0" w:beforeAutospacing="0" w:line="480" w:lineRule="auto"/>
         <w:ind w:left="720" w:hanging="360"/>
@@ -19170,8 +19451,8 @@
         <w:spacing w:after="240" w:before="240" w:line="480" w:lineRule="auto"/>
         <w:rPr/>
       </w:pPr>
-      <w:bookmarkStart w:colFirst="0" w:colLast="0" w:name="_mh40s4mdpe36" w:id="62"/>
-      <w:bookmarkEnd w:id="62"/>
+      <w:bookmarkStart w:colFirst="0" w:colLast="0" w:name="_mh40s4mdpe36" w:id="63"/>
+      <w:bookmarkEnd w:id="63"/>
       <w:r>
         <w:rPr>
           <w:rtl w:val="0"/>
@@ -19184,8 +19465,8 @@
         <w:pStyle w:val="Heading3"/>
         <w:rPr/>
       </w:pPr>
-      <w:bookmarkStart w:colFirst="0" w:colLast="0" w:name="_xw0zabm10j8n" w:id="63"/>
-      <w:bookmarkEnd w:id="63"/>
+      <w:bookmarkStart w:colFirst="0" w:colLast="0" w:name="_xw0zabm10j8n" w:id="64"/>
+      <w:bookmarkEnd w:id="64"/>
       <w:r>
         <w:rPr>
           <w:rtl w:val="0"/>
@@ -19316,7 +19597,7 @@
       <w:pPr>
         <w:numPr>
           <w:ilvl w:val="0"/>
-          <w:numId w:val="10"/>
+          <w:numId w:val="11"/>
         </w:numPr>
         <w:spacing w:after="0" w:afterAutospacing="0" w:before="240" w:line="480" w:lineRule="auto"/>
         <w:ind w:left="720" w:hanging="360"/>
@@ -19359,7 +19640,7 @@
       <w:pPr>
         <w:numPr>
           <w:ilvl w:val="0"/>
-          <w:numId w:val="10"/>
+          <w:numId w:val="11"/>
         </w:numPr>
         <w:spacing w:after="240" w:before="0" w:beforeAutospacing="0" w:line="480" w:lineRule="auto"/>
         <w:ind w:left="720" w:hanging="360"/>
@@ -19538,8 +19819,8 @@
         <w:spacing w:after="240" w:before="240" w:line="480" w:lineRule="auto"/>
         <w:rPr/>
       </w:pPr>
-      <w:bookmarkStart w:colFirst="0" w:colLast="0" w:name="_tfyuqcmox5xh" w:id="64"/>
-      <w:bookmarkEnd w:id="64"/>
+      <w:bookmarkStart w:colFirst="0" w:colLast="0" w:name="_tfyuqcmox5xh" w:id="65"/>
+      <w:bookmarkEnd w:id="65"/>
       <w:r>
         <w:rPr>
           <w:rtl w:val="0"/>
@@ -19585,12 +19866,12 @@
           <wp:inline distB="114300" distT="114300" distL="114300" distR="114300">
             <wp:extent cx="5943600" cy="4102100"/>
             <wp:effectExtent b="0" l="0" r="0" t="0"/>
-            <wp:docPr id="14" name="image20.png"/>
+            <wp:docPr id="15" name="image22.png"/>
             <a:graphic>
               <a:graphicData uri="http://schemas.openxmlformats.org/drawingml/2006/picture">
                 <pic:pic>
                   <pic:nvPicPr>
-                    <pic:cNvPr id="0" name="image20.png"/>
+                    <pic:cNvPr id="0" name="image22.png"/>
                     <pic:cNvPicPr preferRelativeResize="0"/>
                   </pic:nvPicPr>
                   <pic:blipFill>
@@ -19704,12 +19985,12 @@
           <wp:inline distB="114300" distT="114300" distL="114300" distR="114300">
             <wp:extent cx="4781550" cy="3171825"/>
             <wp:effectExtent b="0" l="0" r="0" t="0"/>
-            <wp:docPr id="7" name="image10.png"/>
+            <wp:docPr id="23" name="image8.png"/>
             <a:graphic>
               <a:graphicData uri="http://schemas.openxmlformats.org/drawingml/2006/picture">
                 <pic:pic>
                   <pic:nvPicPr>
-                    <pic:cNvPr id="0" name="image10.png"/>
+                    <pic:cNvPr id="0" name="image8.png"/>
                     <pic:cNvPicPr preferRelativeResize="0"/>
                   </pic:nvPicPr>
                   <pic:blipFill>
@@ -19802,12 +20083,12 @@
           <wp:inline distB="114300" distT="114300" distL="114300" distR="114300">
             <wp:extent cx="5943600" cy="2108200"/>
             <wp:effectExtent b="0" l="0" r="0" t="0"/>
-            <wp:docPr id="22" name="image16.png"/>
+            <wp:docPr id="7" name="image3.png"/>
             <a:graphic>
               <a:graphicData uri="http://schemas.openxmlformats.org/drawingml/2006/picture">
                 <pic:pic>
                   <pic:nvPicPr>
-                    <pic:cNvPr id="0" name="image16.png"/>
+                    <pic:cNvPr id="0" name="image3.png"/>
                     <pic:cNvPicPr preferRelativeResize="0"/>
                   </pic:nvPicPr>
                   <pic:blipFill>
@@ -19964,8 +20245,8 @@
         <w:spacing w:after="240" w:before="240" w:line="480" w:lineRule="auto"/>
         <w:rPr/>
       </w:pPr>
-      <w:bookmarkStart w:colFirst="0" w:colLast="0" w:name="_szmycor1nv6p" w:id="65"/>
-      <w:bookmarkEnd w:id="65"/>
+      <w:bookmarkStart w:colFirst="0" w:colLast="0" w:name="_szmycor1nv6p" w:id="66"/>
+      <w:bookmarkEnd w:id="66"/>
       <w:r>
         <w:rPr>
           <w:rtl w:val="0"/>
@@ -20009,8 +20290,8 @@
           <w:szCs w:val="22"/>
         </w:rPr>
       </w:pPr>
-      <w:bookmarkStart w:colFirst="0" w:colLast="0" w:name="_6bkpcht5wy0" w:id="66"/>
-      <w:bookmarkEnd w:id="66"/>
+      <w:bookmarkStart w:colFirst="0" w:colLast="0" w:name="_6bkpcht5wy0" w:id="67"/>
+      <w:bookmarkEnd w:id="67"/>
       <w:r>
         <w:rPr>
           <w:color w:val="000000"/>
@@ -20304,12 +20585,12 @@
           <wp:inline distB="114300" distT="114300" distL="114300" distR="114300">
             <wp:extent cx="5943600" cy="3771900"/>
             <wp:effectExtent b="0" l="0" r="0" t="0"/>
-            <wp:docPr id="18" name="image13.png"/>
+            <wp:docPr id="2" name="image2.png"/>
             <a:graphic>
               <a:graphicData uri="http://schemas.openxmlformats.org/drawingml/2006/picture">
                 <pic:pic>
                   <pic:nvPicPr>
-                    <pic:cNvPr id="0" name="image13.png"/>
+                    <pic:cNvPr id="0" name="image2.png"/>
                     <pic:cNvPicPr preferRelativeResize="0"/>
                   </pic:nvPicPr>
                   <pic:blipFill>
@@ -20383,8 +20664,8 @@
           <w:szCs w:val="22"/>
         </w:rPr>
       </w:pPr>
-      <w:bookmarkStart w:colFirst="0" w:colLast="0" w:name="_dsb42pr2571r" w:id="67"/>
-      <w:bookmarkEnd w:id="67"/>
+      <w:bookmarkStart w:colFirst="0" w:colLast="0" w:name="_dsb42pr2571r" w:id="68"/>
+      <w:bookmarkEnd w:id="68"/>
       <w:r>
         <w:rPr>
           <w:color w:val="000000"/>
@@ -20646,12 +20927,12 @@
           <wp:inline distB="114300" distT="114300" distL="114300" distR="114300">
             <wp:extent cx="5943600" cy="3327400"/>
             <wp:effectExtent b="0" l="0" r="0" t="0"/>
-            <wp:docPr id="15" name="image21.png"/>
+            <wp:docPr id="4" name="image7.png"/>
             <a:graphic>
               <a:graphicData uri="http://schemas.openxmlformats.org/drawingml/2006/picture">
                 <pic:pic>
                   <pic:nvPicPr>
-                    <pic:cNvPr id="0" name="image21.png"/>
+                    <pic:cNvPr id="0" name="image7.png"/>
                     <pic:cNvPicPr preferRelativeResize="0"/>
                   </pic:nvPicPr>
                   <pic:blipFill>
@@ -20704,8 +20985,8 @@
         <w:spacing w:after="240" w:before="240" w:line="480" w:lineRule="auto"/>
         <w:rPr/>
       </w:pPr>
-      <w:bookmarkStart w:colFirst="0" w:colLast="0" w:name="_7u7fvmuxit3o" w:id="68"/>
-      <w:bookmarkEnd w:id="68"/>
+      <w:bookmarkStart w:colFirst="0" w:colLast="0" w:name="_7u7fvmuxit3o" w:id="69"/>
+      <w:bookmarkEnd w:id="69"/>
       <w:r>
         <w:rPr>
           <w:rtl w:val="0"/>
@@ -20951,12 +21232,12 @@
           <wp:inline distB="114300" distT="114300" distL="114300" distR="114300">
             <wp:extent cx="5943600" cy="3517900"/>
             <wp:effectExtent b="0" l="0" r="0" t="0"/>
-            <wp:docPr id="4" name="image17.png"/>
+            <wp:docPr id="6" name="image1.png"/>
             <a:graphic>
               <a:graphicData uri="http://schemas.openxmlformats.org/drawingml/2006/picture">
                 <pic:pic>
                   <pic:nvPicPr>
-                    <pic:cNvPr id="0" name="image17.png"/>
+                    <pic:cNvPr id="0" name="image1.png"/>
                     <pic:cNvPicPr preferRelativeResize="0"/>
                   </pic:nvPicPr>
                   <pic:blipFill>
@@ -21001,8 +21282,8 @@
         <w:spacing w:after="240" w:before="240" w:line="480" w:lineRule="auto"/>
         <w:rPr/>
       </w:pPr>
-      <w:bookmarkStart w:colFirst="0" w:colLast="0" w:name="_b6zv6yjpw6nc" w:id="69"/>
-      <w:bookmarkEnd w:id="69"/>
+      <w:bookmarkStart w:colFirst="0" w:colLast="0" w:name="_b6zv6yjpw6nc" w:id="70"/>
+      <w:bookmarkEnd w:id="70"/>
       <w:r>
         <w:rPr>
           <w:rtl w:val="0"/>
@@ -21210,7 +21491,7 @@
       <w:pPr>
         <w:numPr>
           <w:ilvl w:val="0"/>
-          <w:numId w:val="12"/>
+          <w:numId w:val="13"/>
         </w:numPr>
         <w:spacing w:after="0" w:afterAutospacing="0" w:before="240" w:line="480" w:lineRule="auto"/>
         <w:ind w:left="720" w:hanging="360"/>
@@ -21297,7 +21578,7 @@
       <w:pPr>
         <w:numPr>
           <w:ilvl w:val="0"/>
-          <w:numId w:val="12"/>
+          <w:numId w:val="13"/>
         </w:numPr>
         <w:spacing w:after="240" w:before="0" w:beforeAutospacing="0" w:line="480" w:lineRule="auto"/>
         <w:ind w:left="720" w:hanging="360"/>
@@ -21449,12 +21730,12 @@
           <wp:inline distB="114300" distT="114300" distL="114300" distR="114300">
             <wp:extent cx="5943600" cy="3327400"/>
             <wp:effectExtent b="0" l="0" r="0" t="0"/>
-            <wp:docPr id="21" name="image23.png"/>
+            <wp:docPr id="8" name="image19.png"/>
             <a:graphic>
               <a:graphicData uri="http://schemas.openxmlformats.org/drawingml/2006/picture">
                 <pic:pic>
                   <pic:nvPicPr>
-                    <pic:cNvPr id="0" name="image23.png"/>
+                    <pic:cNvPr id="0" name="image19.png"/>
                     <pic:cNvPicPr preferRelativeResize="0"/>
                   </pic:nvPicPr>
                   <pic:blipFill>
@@ -21507,8 +21788,8 @@
         <w:spacing w:after="240" w:before="240" w:line="480" w:lineRule="auto"/>
         <w:rPr/>
       </w:pPr>
-      <w:bookmarkStart w:colFirst="0" w:colLast="0" w:name="_911rlw6895bb" w:id="70"/>
-      <w:bookmarkEnd w:id="70"/>
+      <w:bookmarkStart w:colFirst="0" w:colLast="0" w:name="_911rlw6895bb" w:id="71"/>
+      <w:bookmarkEnd w:id="71"/>
       <w:r>
         <w:rPr>
           <w:rtl w:val="0"/>
@@ -22425,8 +22706,8 @@
         <w:spacing w:after="240" w:before="240" w:line="480" w:lineRule="auto"/>
         <w:rPr/>
       </w:pPr>
-      <w:bookmarkStart w:colFirst="0" w:colLast="0" w:name="_tjnggiziquk" w:id="71"/>
-      <w:bookmarkEnd w:id="71"/>
+      <w:bookmarkStart w:colFirst="0" w:colLast="0" w:name="_tjnggiziquk" w:id="72"/>
+      <w:bookmarkEnd w:id="72"/>
       <w:r>
         <w:rPr>
           <w:rtl w:val="0"/>
@@ -22575,8 +22856,8 @@
         <w:spacing w:after="240" w:before="240" w:line="480" w:lineRule="auto"/>
         <w:rPr/>
       </w:pPr>
-      <w:bookmarkStart w:colFirst="0" w:colLast="0" w:name="_s1st5ybgvq10" w:id="72"/>
-      <w:bookmarkEnd w:id="72"/>
+      <w:bookmarkStart w:colFirst="0" w:colLast="0" w:name="_s1st5ybgvq10" w:id="73"/>
+      <w:bookmarkEnd w:id="73"/>
       <w:r>
         <w:rPr>
           <w:rtl w:val="0"/>
@@ -22589,8 +22870,8 @@
         <w:pStyle w:val="Heading3"/>
         <w:rPr/>
       </w:pPr>
-      <w:bookmarkStart w:colFirst="0" w:colLast="0" w:name="_lu41ke36s37i" w:id="73"/>
-      <w:bookmarkEnd w:id="73"/>
+      <w:bookmarkStart w:colFirst="0" w:colLast="0" w:name="_lu41ke36s37i" w:id="74"/>
+      <w:bookmarkEnd w:id="74"/>
       <w:r>
         <w:rPr>
           <w:rtl w:val="0"/>
@@ -22704,7 +22985,7 @@
       <w:pPr>
         <w:numPr>
           <w:ilvl w:val="0"/>
-          <w:numId w:val="11"/>
+          <w:numId w:val="12"/>
         </w:numPr>
         <w:spacing w:after="0" w:afterAutospacing="0" w:before="240" w:line="480" w:lineRule="auto"/>
         <w:ind w:left="720" w:hanging="360"/>
@@ -22755,7 +23036,7 @@
       <w:pPr>
         <w:numPr>
           <w:ilvl w:val="0"/>
-          <w:numId w:val="11"/>
+          <w:numId w:val="12"/>
         </w:numPr>
         <w:spacing w:after="240" w:before="0" w:beforeAutospacing="0" w:line="480" w:lineRule="auto"/>
         <w:ind w:left="720" w:hanging="360"/>
@@ -22807,8 +23088,8 @@
         <w:pStyle w:val="Heading3"/>
         <w:rPr/>
       </w:pPr>
-      <w:bookmarkStart w:colFirst="0" w:colLast="0" w:name="_7upktg5lgeix" w:id="74"/>
-      <w:bookmarkEnd w:id="74"/>
+      <w:bookmarkStart w:colFirst="0" w:colLast="0" w:name="_7upktg5lgeix" w:id="75"/>
+      <w:bookmarkEnd w:id="75"/>
       <w:r>
         <w:rPr>
           <w:rtl w:val="0"/>
@@ -22969,12 +23250,12 @@
           <wp:inline distB="114300" distT="114300" distL="114300" distR="114300">
             <wp:extent cx="5943600" cy="2108200"/>
             <wp:effectExtent b="0" l="0" r="0" t="0"/>
-            <wp:docPr id="1" name="image4.png"/>
+            <wp:docPr id="24" name="image16.png"/>
             <a:graphic>
               <a:graphicData uri="http://schemas.openxmlformats.org/drawingml/2006/picture">
                 <pic:pic>
                   <pic:nvPicPr>
-                    <pic:cNvPr id="0" name="image4.png"/>
+                    <pic:cNvPr id="0" name="image16.png"/>
                     <pic:cNvPicPr preferRelativeResize="0"/>
                   </pic:nvPicPr>
                   <pic:blipFill>
@@ -23042,8 +23323,8 @@
         <w:pStyle w:val="Heading3"/>
         <w:rPr/>
       </w:pPr>
-      <w:bookmarkStart w:colFirst="0" w:colLast="0" w:name="_klzojxhoagzr" w:id="75"/>
-      <w:bookmarkEnd w:id="75"/>
+      <w:bookmarkStart w:colFirst="0" w:colLast="0" w:name="_klzojxhoagzr" w:id="76"/>
+      <w:bookmarkEnd w:id="76"/>
       <w:r>
         <w:rPr>
           <w:rtl w:val="0"/>
@@ -23056,8 +23337,8 @@
         <w:pStyle w:val="Heading4"/>
         <w:rPr/>
       </w:pPr>
-      <w:bookmarkStart w:colFirst="0" w:colLast="0" w:name="_g8fq5drdxqgh" w:id="76"/>
-      <w:bookmarkEnd w:id="76"/>
+      <w:bookmarkStart w:colFirst="0" w:colLast="0" w:name="_g8fq5drdxqgh" w:id="77"/>
+      <w:bookmarkEnd w:id="77"/>
       <w:r>
         <w:rPr>
           <w:rtl w:val="0"/>
@@ -23219,12 +23500,12 @@
           <wp:inline distB="114300" distT="114300" distL="114300" distR="114300">
             <wp:extent cx="5943600" cy="3632200"/>
             <wp:effectExtent b="0" l="0" r="0" t="0"/>
-            <wp:docPr id="5" name="image6.png"/>
+            <wp:docPr id="21" name="image24.png"/>
             <a:graphic>
               <a:graphicData uri="http://schemas.openxmlformats.org/drawingml/2006/picture">
                 <pic:pic>
                   <pic:nvPicPr>
-                    <pic:cNvPr id="0" name="image6.png"/>
+                    <pic:cNvPr id="0" name="image24.png"/>
                     <pic:cNvPicPr preferRelativeResize="0"/>
                   </pic:nvPicPr>
                   <pic:blipFill>
@@ -23439,8 +23720,8 @@
         <w:spacing w:after="240" w:before="240" w:line="480" w:lineRule="auto"/>
         <w:rPr/>
       </w:pPr>
-      <w:bookmarkStart w:colFirst="0" w:colLast="0" w:name="_wny3kj8cz6lp" w:id="77"/>
-      <w:bookmarkEnd w:id="77"/>
+      <w:bookmarkStart w:colFirst="0" w:colLast="0" w:name="_wny3kj8cz6lp" w:id="78"/>
+      <w:bookmarkEnd w:id="78"/>
       <w:r>
         <w:rPr>
           <w:rtl w:val="0"/>
@@ -23464,7 +23745,7 @@
       <w:pPr>
         <w:numPr>
           <w:ilvl w:val="0"/>
-          <w:numId w:val="13"/>
+          <w:numId w:val="14"/>
         </w:numPr>
         <w:spacing w:after="0" w:afterAutospacing="0" w:before="240" w:line="480" w:lineRule="auto"/>
         <w:ind w:left="720" w:hanging="360"/>
@@ -23482,7 +23763,7 @@
       <w:pPr>
         <w:numPr>
           <w:ilvl w:val="0"/>
-          <w:numId w:val="13"/>
+          <w:numId w:val="14"/>
         </w:numPr>
         <w:spacing w:after="240" w:before="0" w:beforeAutospacing="0" w:line="480" w:lineRule="auto"/>
         <w:ind w:left="720" w:hanging="360"/>
@@ -23869,8 +24150,8 @@
         <w:pStyle w:val="Heading4"/>
         <w:rPr/>
       </w:pPr>
-      <w:bookmarkStart w:colFirst="0" w:colLast="0" w:name="_dehskjh40ju0" w:id="78"/>
-      <w:bookmarkEnd w:id="78"/>
+      <w:bookmarkStart w:colFirst="0" w:colLast="0" w:name="_dehskjh40ju0" w:id="79"/>
+      <w:bookmarkEnd w:id="79"/>
       <w:r>
         <w:rPr>
           <w:rtl w:val="0"/>
@@ -24444,8 +24725,8 @@
         <w:spacing w:after="240" w:before="240" w:line="480" w:lineRule="auto"/>
         <w:rPr/>
       </w:pPr>
-      <w:bookmarkStart w:colFirst="0" w:colLast="0" w:name="_sryzp75tnpmp" w:id="79"/>
-      <w:bookmarkEnd w:id="79"/>
+      <w:bookmarkStart w:colFirst="0" w:colLast="0" w:name="_sryzp75tnpmp" w:id="80"/>
+      <w:bookmarkEnd w:id="80"/>
       <w:r>
         <w:rPr>
           <w:rtl w:val="0"/>
@@ -24888,12 +25169,12 @@
           <wp:inline distB="114300" distT="114300" distL="114300" distR="114300">
             <wp:extent cx="5943600" cy="3276600"/>
             <wp:effectExtent b="0" l="0" r="0" t="0"/>
-            <wp:docPr id="11" name="image8.png"/>
+            <wp:docPr id="17" name="image10.png"/>
             <a:graphic>
               <a:graphicData uri="http://schemas.openxmlformats.org/drawingml/2006/picture">
                 <pic:pic>
                   <pic:nvPicPr>
-                    <pic:cNvPr id="0" name="image8.png"/>
+                    <pic:cNvPr id="0" name="image10.png"/>
                     <pic:cNvPicPr preferRelativeResize="0"/>
                   </pic:nvPicPr>
                   <pic:blipFill>
@@ -24949,8 +25230,8 @@
         <w:pStyle w:val="Heading3"/>
         <w:rPr/>
       </w:pPr>
-      <w:bookmarkStart w:colFirst="0" w:colLast="0" w:name="_hgc8b4lqijlh" w:id="80"/>
-      <w:bookmarkEnd w:id="80"/>
+      <w:bookmarkStart w:colFirst="0" w:colLast="0" w:name="_hgc8b4lqijlh" w:id="81"/>
+      <w:bookmarkEnd w:id="81"/>
       <w:r>
         <w:rPr>
           <w:rtl w:val="0"/>
@@ -25634,8 +25915,8 @@
         <w:pStyle w:val="Heading3"/>
         <w:rPr/>
       </w:pPr>
-      <w:bookmarkStart w:colFirst="0" w:colLast="0" w:name="_jv64x7ssaf38" w:id="81"/>
-      <w:bookmarkEnd w:id="81"/>
+      <w:bookmarkStart w:colFirst="0" w:colLast="0" w:name="_jv64x7ssaf38" w:id="82"/>
+      <w:bookmarkEnd w:id="82"/>
       <w:r>
         <w:rPr>
           <w:rtl w:val="0"/>
@@ -25766,8 +26047,8 @@
         <w:pStyle w:val="Heading2"/>
         <w:rPr/>
       </w:pPr>
-      <w:bookmarkStart w:colFirst="0" w:colLast="0" w:name="_vak1ddnmqyw7" w:id="82"/>
-      <w:bookmarkEnd w:id="82"/>
+      <w:bookmarkStart w:colFirst="0" w:colLast="0" w:name="_vak1ddnmqyw7" w:id="83"/>
+      <w:bookmarkEnd w:id="83"/>
       <w:r>
         <w:rPr>
           <w:rtl w:val="0"/>
@@ -25781,8 +26062,8 @@
         <w:spacing w:after="240" w:before="240" w:line="480" w:lineRule="auto"/>
         <w:rPr/>
       </w:pPr>
-      <w:bookmarkStart w:colFirst="0" w:colLast="0" w:name="_wxr94974xwov" w:id="83"/>
-      <w:bookmarkEnd w:id="83"/>
+      <w:bookmarkStart w:colFirst="0" w:colLast="0" w:name="_wxr94974xwov" w:id="84"/>
+      <w:bookmarkEnd w:id="84"/>
       <w:r>
         <w:rPr>
           <w:rtl w:val="0"/>
@@ -26194,8 +26475,8 @@
         <w:pStyle w:val="Heading3"/>
         <w:rPr/>
       </w:pPr>
-      <w:bookmarkStart w:colFirst="0" w:colLast="0" w:name="_cxg3bdtlgmhm" w:id="84"/>
-      <w:bookmarkEnd w:id="84"/>
+      <w:bookmarkStart w:colFirst="0" w:colLast="0" w:name="_cxg3bdtlgmhm" w:id="85"/>
+      <w:bookmarkEnd w:id="85"/>
       <w:r>
         <w:rPr>
           <w:rtl w:val="0"/>
@@ -26290,12 +26571,12 @@
           <wp:inline distB="114300" distT="114300" distL="114300" distR="114300">
             <wp:extent cx="5943600" cy="4102100"/>
             <wp:effectExtent b="0" l="0" r="0" t="0"/>
-            <wp:docPr id="13" name="image9.png"/>
+            <wp:docPr id="11" name="image15.png"/>
             <a:graphic>
               <a:graphicData uri="http://schemas.openxmlformats.org/drawingml/2006/picture">
                 <pic:pic>
                   <pic:nvPicPr>
-                    <pic:cNvPr id="0" name="image9.png"/>
+                    <pic:cNvPr id="0" name="image15.png"/>
                     <pic:cNvPicPr preferRelativeResize="0"/>
                   </pic:nvPicPr>
                   <pic:blipFill>
@@ -26380,12 +26661,12 @@
           <wp:inline distB="114300" distT="114300" distL="114300" distR="114300">
             <wp:extent cx="4724400" cy="3171825"/>
             <wp:effectExtent b="0" l="0" r="0" t="0"/>
-            <wp:docPr id="10" name="image24.png"/>
+            <wp:docPr id="9" name="image11.png"/>
             <a:graphic>
               <a:graphicData uri="http://schemas.openxmlformats.org/drawingml/2006/picture">
                 <pic:pic>
                   <pic:nvPicPr>
-                    <pic:cNvPr id="0" name="image24.png"/>
+                    <pic:cNvPr id="0" name="image11.png"/>
                     <pic:cNvPicPr preferRelativeResize="0"/>
                   </pic:nvPicPr>
                   <pic:blipFill>
@@ -26497,12 +26778,12 @@
           <wp:inline distB="114300" distT="114300" distL="114300" distR="114300">
             <wp:extent cx="5943600" cy="2082800"/>
             <wp:effectExtent b="0" l="0" r="0" t="0"/>
-            <wp:docPr id="12" name="image11.png"/>
+            <wp:docPr id="19" name="image21.png"/>
             <a:graphic>
               <a:graphicData uri="http://schemas.openxmlformats.org/drawingml/2006/picture">
                 <pic:pic>
                   <pic:nvPicPr>
-                    <pic:cNvPr id="0" name="image11.png"/>
+                    <pic:cNvPr id="0" name="image21.png"/>
                     <pic:cNvPicPr preferRelativeResize="0"/>
                   </pic:nvPicPr>
                   <pic:blipFill>
@@ -26558,8 +26839,8 @@
         <w:pStyle w:val="Heading3"/>
         <w:rPr/>
       </w:pPr>
-      <w:bookmarkStart w:colFirst="0" w:colLast="0" w:name="_d9izsr6i8k6" w:id="85"/>
-      <w:bookmarkEnd w:id="85"/>
+      <w:bookmarkStart w:colFirst="0" w:colLast="0" w:name="_d9izsr6i8k6" w:id="86"/>
+      <w:bookmarkEnd w:id="86"/>
       <w:r>
         <w:rPr>
           <w:rtl w:val="0"/>
@@ -27134,12 +27415,12 @@
           <wp:inline distB="114300" distT="114300" distL="114300" distR="114300">
             <wp:extent cx="5943600" cy="3289300"/>
             <wp:effectExtent b="0" l="0" r="0" t="0"/>
-            <wp:docPr id="24" name="image19.png"/>
+            <wp:docPr id="18" name="image20.png"/>
             <a:graphic>
               <a:graphicData uri="http://schemas.openxmlformats.org/drawingml/2006/picture">
                 <pic:pic>
                   <pic:nvPicPr>
-                    <pic:cNvPr id="0" name="image19.png"/>
+                    <pic:cNvPr id="0" name="image20.png"/>
                     <pic:cNvPicPr preferRelativeResize="0"/>
                   </pic:nvPicPr>
                   <pic:blipFill>
@@ -27184,8 +27465,8 @@
         <w:spacing w:after="240" w:before="240" w:line="480" w:lineRule="auto"/>
         <w:rPr/>
       </w:pPr>
-      <w:bookmarkStart w:colFirst="0" w:colLast="0" w:name="_36166alolxj3" w:id="86"/>
-      <w:bookmarkEnd w:id="86"/>
+      <w:bookmarkStart w:colFirst="0" w:colLast="0" w:name="_36166alolxj3" w:id="87"/>
+      <w:bookmarkEnd w:id="87"/>
       <w:r>
         <w:rPr>
           <w:rtl w:val="0"/>
@@ -27542,8 +27823,8 @@
         <w:pStyle w:val="Heading3"/>
         <w:rPr/>
       </w:pPr>
-      <w:bookmarkStart w:colFirst="0" w:colLast="0" w:name="_qr3xqyt3e9vy" w:id="87"/>
-      <w:bookmarkEnd w:id="87"/>
+      <w:bookmarkStart w:colFirst="0" w:colLast="0" w:name="_qr3xqyt3e9vy" w:id="88"/>
+      <w:bookmarkEnd w:id="88"/>
       <w:r>
         <w:rPr>
           <w:rtl w:val="0"/>
@@ -27946,8 +28227,8 @@
         <w:pStyle w:val="Heading3"/>
         <w:rPr/>
       </w:pPr>
-      <w:bookmarkStart w:colFirst="0" w:colLast="0" w:name="_5sccflegvuf8" w:id="88"/>
-      <w:bookmarkEnd w:id="88"/>
+      <w:bookmarkStart w:colFirst="0" w:colLast="0" w:name="_5sccflegvuf8" w:id="89"/>
+      <w:bookmarkEnd w:id="89"/>
       <w:r>
         <w:rPr>
           <w:rtl w:val="0"/>
@@ -28165,8 +28446,8 @@
         <w:pStyle w:val="Heading2"/>
         <w:rPr/>
       </w:pPr>
-      <w:bookmarkStart w:colFirst="0" w:colLast="0" w:name="_du47ny3ef09b" w:id="89"/>
-      <w:bookmarkEnd w:id="89"/>
+      <w:bookmarkStart w:colFirst="0" w:colLast="0" w:name="_du47ny3ef09b" w:id="90"/>
+      <w:bookmarkEnd w:id="90"/>
       <w:r>
         <w:rPr>
           <w:rtl w:val="0"/>
@@ -28300,7 +28581,7 @@
       <w:pPr>
         <w:numPr>
           <w:ilvl w:val="0"/>
-          <w:numId w:val="9"/>
+          <w:numId w:val="10"/>
         </w:numPr>
         <w:spacing w:after="0" w:afterAutospacing="0" w:before="240" w:line="480" w:lineRule="auto"/>
         <w:ind w:left="720" w:hanging="360"/>
@@ -28345,7 +28626,7 @@
       <w:pPr>
         <w:numPr>
           <w:ilvl w:val="0"/>
-          <w:numId w:val="9"/>
+          <w:numId w:val="10"/>
         </w:numPr>
         <w:spacing w:after="240" w:before="0" w:beforeAutospacing="0" w:line="480" w:lineRule="auto"/>
         <w:ind w:left="720" w:hanging="360"/>
@@ -28648,8 +28929,8 @@
           <w:szCs w:val="46"/>
         </w:rPr>
       </w:pPr>
-      <w:bookmarkStart w:colFirst="0" w:colLast="0" w:name="_l06rsztjjqzv" w:id="90"/>
-      <w:bookmarkEnd w:id="90"/>
+      <w:bookmarkStart w:colFirst="0" w:colLast="0" w:name="_l06rsztjjqzv" w:id="91"/>
+      <w:bookmarkEnd w:id="91"/>
       <w:r>
         <w:rPr>
           <w:b w:val="1"/>
@@ -28666,8 +28947,8 @@
         <w:pStyle w:val="Heading2"/>
         <w:rPr/>
       </w:pPr>
-      <w:bookmarkStart w:colFirst="0" w:colLast="0" w:name="_q8cywfvh6kxw" w:id="91"/>
-      <w:bookmarkEnd w:id="91"/>
+      <w:bookmarkStart w:colFirst="0" w:colLast="0" w:name="_q8cywfvh6kxw" w:id="92"/>
+      <w:bookmarkEnd w:id="92"/>
       <w:r>
         <w:rPr>
           <w:rtl w:val="0"/>
@@ -28719,8 +29000,8 @@
         <w:spacing w:after="240" w:before="240" w:line="480" w:lineRule="auto"/>
         <w:rPr/>
       </w:pPr>
-      <w:bookmarkStart w:colFirst="0" w:colLast="0" w:name="_mwl3verwh04h" w:id="92"/>
-      <w:bookmarkEnd w:id="92"/>
+      <w:bookmarkStart w:colFirst="0" w:colLast="0" w:name="_mwl3verwh04h" w:id="93"/>
+      <w:bookmarkEnd w:id="93"/>
       <w:r>
         <w:rPr>
           <w:rtl w:val="0"/>
@@ -28880,8 +29161,8 @@
         <w:spacing w:after="240" w:before="240" w:line="480" w:lineRule="auto"/>
         <w:rPr/>
       </w:pPr>
-      <w:bookmarkStart w:colFirst="0" w:colLast="0" w:name="_rvwyeepgjrgx" w:id="93"/>
-      <w:bookmarkEnd w:id="93"/>
+      <w:bookmarkStart w:colFirst="0" w:colLast="0" w:name="_rvwyeepgjrgx" w:id="94"/>
+      <w:bookmarkEnd w:id="94"/>
       <w:r>
         <w:rPr>
           <w:rtl w:val="0"/>
@@ -28895,8 +29176,8 @@
         <w:spacing w:after="240" w:before="240" w:line="480" w:lineRule="auto"/>
         <w:rPr/>
       </w:pPr>
-      <w:bookmarkStart w:colFirst="0" w:colLast="0" w:name="_3ac4isj99klt" w:id="94"/>
-      <w:bookmarkEnd w:id="94"/>
+      <w:bookmarkStart w:colFirst="0" w:colLast="0" w:name="_3ac4isj99klt" w:id="95"/>
+      <w:bookmarkEnd w:id="95"/>
       <w:r>
         <w:rPr>
           <w:rtl w:val="0"/>
@@ -29085,8 +29366,8 @@
         <w:spacing w:after="240" w:before="240" w:line="480" w:lineRule="auto"/>
         <w:rPr/>
       </w:pPr>
-      <w:bookmarkStart w:colFirst="0" w:colLast="0" w:name="_2mmmymfiaqyp" w:id="95"/>
-      <w:bookmarkEnd w:id="95"/>
+      <w:bookmarkStart w:colFirst="0" w:colLast="0" w:name="_2mmmymfiaqyp" w:id="96"/>
+      <w:bookmarkEnd w:id="96"/>
       <w:r>
         <w:rPr>
           <w:rtl w:val="0"/>
@@ -29340,8 +29621,8 @@
         <w:spacing w:after="240" w:before="240" w:line="480" w:lineRule="auto"/>
         <w:rPr/>
       </w:pPr>
-      <w:bookmarkStart w:colFirst="0" w:colLast="0" w:name="_7w8f3z2a40wb" w:id="96"/>
-      <w:bookmarkEnd w:id="96"/>
+      <w:bookmarkStart w:colFirst="0" w:colLast="0" w:name="_7w8f3z2a40wb" w:id="97"/>
+      <w:bookmarkEnd w:id="97"/>
       <w:r>
         <w:rPr>
           <w:rtl w:val="0"/>
@@ -29354,8 +29635,8 @@
         <w:pStyle w:val="Heading3"/>
         <w:rPr/>
       </w:pPr>
-      <w:bookmarkStart w:colFirst="0" w:colLast="0" w:name="_2hpcjet60kbq" w:id="97"/>
-      <w:bookmarkEnd w:id="97"/>
+      <w:bookmarkStart w:colFirst="0" w:colLast="0" w:name="_2hpcjet60kbq" w:id="98"/>
+      <w:bookmarkEnd w:id="98"/>
       <w:r>
         <w:rPr>
           <w:rtl w:val="0"/>
@@ -29620,8 +29901,8 @@
         <w:spacing w:after="240" w:before="240" w:line="480" w:lineRule="auto"/>
         <w:rPr/>
       </w:pPr>
-      <w:bookmarkStart w:colFirst="0" w:colLast="0" w:name="_v64ut3w9u0bs" w:id="98"/>
-      <w:bookmarkEnd w:id="98"/>
+      <w:bookmarkStart w:colFirst="0" w:colLast="0" w:name="_v64ut3w9u0bs" w:id="99"/>
+      <w:bookmarkEnd w:id="99"/>
       <w:r>
         <w:rPr>
           <w:rtl w:val="0"/>
@@ -29741,8 +30022,8 @@
         <w:spacing w:after="240" w:before="240" w:line="480" w:lineRule="auto"/>
         <w:rPr/>
       </w:pPr>
-      <w:bookmarkStart w:colFirst="0" w:colLast="0" w:name="_cbgqptsh63qu" w:id="99"/>
-      <w:bookmarkEnd w:id="99"/>
+      <w:bookmarkStart w:colFirst="0" w:colLast="0" w:name="_cbgqptsh63qu" w:id="100"/>
+      <w:bookmarkEnd w:id="100"/>
       <w:r>
         <w:rPr>
           <w:rtl w:val="0"/>
@@ -29755,8 +30036,8 @@
         <w:pStyle w:val="Heading3"/>
         <w:rPr/>
       </w:pPr>
-      <w:bookmarkStart w:colFirst="0" w:colLast="0" w:name="_irewzqql7v3w" w:id="100"/>
-      <w:bookmarkEnd w:id="100"/>
+      <w:bookmarkStart w:colFirst="0" w:colLast="0" w:name="_irewzqql7v3w" w:id="101"/>
+      <w:bookmarkEnd w:id="101"/>
       <w:r>
         <w:rPr>
           <w:rtl w:val="0"/>
@@ -29927,8 +30208,8 @@
         <w:spacing w:after="240" w:before="240" w:line="480" w:lineRule="auto"/>
         <w:rPr/>
       </w:pPr>
-      <w:bookmarkStart w:colFirst="0" w:colLast="0" w:name="_55eo27x70d9v" w:id="101"/>
-      <w:bookmarkEnd w:id="101"/>
+      <w:bookmarkStart w:colFirst="0" w:colLast="0" w:name="_55eo27x70d9v" w:id="102"/>
+      <w:bookmarkEnd w:id="102"/>
       <w:r>
         <w:rPr>
           <w:rtl w:val="0"/>
@@ -30062,8 +30343,8 @@
         <w:spacing w:after="240" w:before="240" w:line="480" w:lineRule="auto"/>
         <w:rPr/>
       </w:pPr>
-      <w:bookmarkStart w:colFirst="0" w:colLast="0" w:name="_d6hd6g9v8spr" w:id="102"/>
-      <w:bookmarkEnd w:id="102"/>
+      <w:bookmarkStart w:colFirst="0" w:colLast="0" w:name="_d6hd6g9v8spr" w:id="103"/>
+      <w:bookmarkEnd w:id="103"/>
       <w:r>
         <w:rPr>
           <w:rtl w:val="0"/>
@@ -30077,8 +30358,8 @@
         <w:spacing w:after="240" w:before="240" w:line="480" w:lineRule="auto"/>
         <w:rPr/>
       </w:pPr>
-      <w:bookmarkStart w:colFirst="0" w:colLast="0" w:name="_v8dsgnb5cvuo" w:id="103"/>
-      <w:bookmarkEnd w:id="103"/>
+      <w:bookmarkStart w:colFirst="0" w:colLast="0" w:name="_v8dsgnb5cvuo" w:id="104"/>
+      <w:bookmarkEnd w:id="104"/>
       <w:r>
         <w:rPr>
           <w:rtl w:val="0"/>
@@ -30153,8 +30434,8 @@
         <w:pStyle w:val="Heading3"/>
         <w:rPr/>
       </w:pPr>
-      <w:bookmarkStart w:colFirst="0" w:colLast="0" w:name="_lexb4xqvks23" w:id="104"/>
-      <w:bookmarkEnd w:id="104"/>
+      <w:bookmarkStart w:colFirst="0" w:colLast="0" w:name="_lexb4xqvks23" w:id="105"/>
+      <w:bookmarkEnd w:id="105"/>
       <w:r>
         <w:rPr>
           <w:rtl w:val="0"/>
@@ -30265,8 +30546,8 @@
         <w:pStyle w:val="Heading2"/>
         <w:rPr/>
       </w:pPr>
-      <w:bookmarkStart w:colFirst="0" w:colLast="0" w:name="_rexzc6ud41vk" w:id="105"/>
-      <w:bookmarkEnd w:id="105"/>
+      <w:bookmarkStart w:colFirst="0" w:colLast="0" w:name="_rexzc6ud41vk" w:id="106"/>
+      <w:bookmarkEnd w:id="106"/>
       <w:r>
         <w:rPr>
           <w:rtl w:val="0"/>
@@ -30292,8 +30573,8 @@
         <w:spacing w:after="240" w:before="240" w:line="480" w:lineRule="auto"/>
         <w:rPr/>
       </w:pPr>
-      <w:bookmarkStart w:colFirst="0" w:colLast="0" w:name="_ie4g3xf8rx7f" w:id="106"/>
-      <w:bookmarkEnd w:id="106"/>
+      <w:bookmarkStart w:colFirst="0" w:colLast="0" w:name="_ie4g3xf8rx7f" w:id="107"/>
+      <w:bookmarkEnd w:id="107"/>
       <w:r>
         <w:rPr>
           <w:rtl w:val="0"/>
@@ -30466,8 +30747,8 @@
         <w:spacing w:after="240" w:before="240" w:line="480" w:lineRule="auto"/>
         <w:rPr/>
       </w:pPr>
-      <w:bookmarkStart w:colFirst="0" w:colLast="0" w:name="_668qv0tnk1rd" w:id="107"/>
-      <w:bookmarkEnd w:id="107"/>
+      <w:bookmarkStart w:colFirst="0" w:colLast="0" w:name="_668qv0tnk1rd" w:id="108"/>
+      <w:bookmarkEnd w:id="108"/>
       <w:r>
         <w:rPr>
           <w:rtl w:val="0"/>
@@ -30529,8 +30810,8 @@
         <w:spacing w:after="240" w:before="240" w:line="480" w:lineRule="auto"/>
         <w:rPr/>
       </w:pPr>
-      <w:bookmarkStart w:colFirst="0" w:colLast="0" w:name="_pkzs6ysfghqb" w:id="108"/>
-      <w:bookmarkEnd w:id="108"/>
+      <w:bookmarkStart w:colFirst="0" w:colLast="0" w:name="_pkzs6ysfghqb" w:id="109"/>
+      <w:bookmarkEnd w:id="109"/>
       <w:r>
         <w:rPr>
           <w:rtl w:val="0"/>
@@ -30592,8 +30873,8 @@
         <w:spacing w:after="240" w:before="240" w:line="480" w:lineRule="auto"/>
         <w:rPr/>
       </w:pPr>
-      <w:bookmarkStart w:colFirst="0" w:colLast="0" w:name="_7qk572697kpp" w:id="109"/>
-      <w:bookmarkEnd w:id="109"/>
+      <w:bookmarkStart w:colFirst="0" w:colLast="0" w:name="_7qk572697kpp" w:id="110"/>
+      <w:bookmarkEnd w:id="110"/>
       <w:r>
         <w:rPr>
           <w:rtl w:val="0"/>
@@ -30643,8 +30924,8 @@
         <w:spacing w:after="240" w:before="240" w:line="480" w:lineRule="auto"/>
         <w:rPr/>
       </w:pPr>
-      <w:bookmarkStart w:colFirst="0" w:colLast="0" w:name="_9baqka1wozxv" w:id="110"/>
-      <w:bookmarkEnd w:id="110"/>
+      <w:bookmarkStart w:colFirst="0" w:colLast="0" w:name="_9baqka1wozxv" w:id="111"/>
+      <w:bookmarkEnd w:id="111"/>
       <w:r>
         <w:rPr>
           <w:rtl w:val="0"/>
@@ -30774,8 +31055,8 @@
         <w:pStyle w:val="Heading2"/>
         <w:rPr/>
       </w:pPr>
-      <w:bookmarkStart w:colFirst="0" w:colLast="0" w:name="_x6wjesquisgm" w:id="111"/>
-      <w:bookmarkEnd w:id="111"/>
+      <w:bookmarkStart w:colFirst="0" w:colLast="0" w:name="_x6wjesquisgm" w:id="112"/>
+      <w:bookmarkEnd w:id="112"/>
       <w:r>
         <w:rPr>
           <w:rtl w:val="0"/>
@@ -30956,8 +31237,8 @@
         <w:pStyle w:val="Heading2"/>
         <w:rPr/>
       </w:pPr>
-      <w:bookmarkStart w:colFirst="0" w:colLast="0" w:name="_6t9lzwz36rtb" w:id="112"/>
-      <w:bookmarkEnd w:id="112"/>
+      <w:bookmarkStart w:colFirst="0" w:colLast="0" w:name="_6t9lzwz36rtb" w:id="113"/>
+      <w:bookmarkEnd w:id="113"/>
       <w:r>
         <w:rPr>
           <w:rtl w:val="0"/>
@@ -31082,8 +31363,8 @@
         <w:ind w:left="720"/>
         <w:rPr/>
       </w:pPr>
-      <w:bookmarkStart w:colFirst="0" w:colLast="0" w:name="_ebj5d3b4l1t3" w:id="113"/>
-      <w:bookmarkEnd w:id="113"/>
+      <w:bookmarkStart w:colFirst="0" w:colLast="0" w:name="_ebj5d3b4l1t3" w:id="114"/>
+      <w:bookmarkEnd w:id="114"/>
       <w:r>
         <w:rPr>
           <w:b w:val="1"/>
@@ -40048,6 +40329,116 @@
   <w:abstractNum w:abstractNumId="14">
     <w:lvl w:ilvl="0">
       <w:start w:val="1"/>
+      <w:numFmt w:val="bullet"/>
+      <w:lvlText w:val="●"/>
+      <w:lvlJc w:val="left"/>
+      <w:pPr>
+        <w:ind w:left="720" w:hanging="360"/>
+      </w:pPr>
+      <w:rPr>
+        <w:u w:val="none"/>
+      </w:rPr>
+    </w:lvl>
+    <w:lvl w:ilvl="1">
+      <w:start w:val="1"/>
+      <w:numFmt w:val="bullet"/>
+      <w:lvlText w:val="○"/>
+      <w:lvlJc w:val="left"/>
+      <w:pPr>
+        <w:ind w:left="1440" w:hanging="360"/>
+      </w:pPr>
+      <w:rPr>
+        <w:u w:val="none"/>
+      </w:rPr>
+    </w:lvl>
+    <w:lvl w:ilvl="2">
+      <w:start w:val="1"/>
+      <w:numFmt w:val="bullet"/>
+      <w:lvlText w:val="■"/>
+      <w:lvlJc w:val="left"/>
+      <w:pPr>
+        <w:ind w:left="2160" w:hanging="360"/>
+      </w:pPr>
+      <w:rPr>
+        <w:u w:val="none"/>
+      </w:rPr>
+    </w:lvl>
+    <w:lvl w:ilvl="3">
+      <w:start w:val="1"/>
+      <w:numFmt w:val="bullet"/>
+      <w:lvlText w:val="●"/>
+      <w:lvlJc w:val="left"/>
+      <w:pPr>
+        <w:ind w:left="2880" w:hanging="360"/>
+      </w:pPr>
+      <w:rPr>
+        <w:u w:val="none"/>
+      </w:rPr>
+    </w:lvl>
+    <w:lvl w:ilvl="4">
+      <w:start w:val="1"/>
+      <w:numFmt w:val="bullet"/>
+      <w:lvlText w:val="○"/>
+      <w:lvlJc w:val="left"/>
+      <w:pPr>
+        <w:ind w:left="3600" w:hanging="360"/>
+      </w:pPr>
+      <w:rPr>
+        <w:u w:val="none"/>
+      </w:rPr>
+    </w:lvl>
+    <w:lvl w:ilvl="5">
+      <w:start w:val="1"/>
+      <w:numFmt w:val="bullet"/>
+      <w:lvlText w:val="■"/>
+      <w:lvlJc w:val="left"/>
+      <w:pPr>
+        <w:ind w:left="4320" w:hanging="360"/>
+      </w:pPr>
+      <w:rPr>
+        <w:u w:val="none"/>
+      </w:rPr>
+    </w:lvl>
+    <w:lvl w:ilvl="6">
+      <w:start w:val="1"/>
+      <w:numFmt w:val="bullet"/>
+      <w:lvlText w:val="●"/>
+      <w:lvlJc w:val="left"/>
+      <w:pPr>
+        <w:ind w:left="5040" w:hanging="360"/>
+      </w:pPr>
+      <w:rPr>
+        <w:u w:val="none"/>
+      </w:rPr>
+    </w:lvl>
+    <w:lvl w:ilvl="7">
+      <w:start w:val="1"/>
+      <w:numFmt w:val="bullet"/>
+      <w:lvlText w:val="○"/>
+      <w:lvlJc w:val="left"/>
+      <w:pPr>
+        <w:ind w:left="5760" w:hanging="360"/>
+      </w:pPr>
+      <w:rPr>
+        <w:u w:val="none"/>
+      </w:rPr>
+    </w:lvl>
+    <w:lvl w:ilvl="8">
+      <w:start w:val="1"/>
+      <w:numFmt w:val="bullet"/>
+      <w:lvlText w:val="■"/>
+      <w:lvlJc w:val="left"/>
+      <w:pPr>
+        <w:ind w:left="6480" w:hanging="360"/>
+      </w:pPr>
+      <w:rPr>
+        <w:u w:val="none"/>
+      </w:rPr>
+    </w:lvl>
+  </w:abstractNum>
+  <w:abstractNum w:abstractNumId="15">
+    <w:lvl w:ilvl="0">
+      <w:start w:val="1"/>
       <w:numFmt w:val="decimal"/>
       <w:lvlText w:val="%1."/>
       <w:lvlJc w:val="left"/>
@@ -40196,6 +40587,9 @@
   </w:num>
   <w:num w:numId="14">
     <w:abstractNumId w:val="14"/>
+  </w:num>
+  <w:num w:numId="15">
+    <w:abstractNumId w:val="15"/>
   </w:num>
 </w:numbering>
 </file>

</xml_diff>

<commit_message>
final change before paper submit
</commit_message>
<xml_diff>
--- a/thesis2/Draft-Thesis.docx
+++ b/thesis2/Draft-Thesis.docx
@@ -41,7 +41,7 @@
           <w:pgNumType w:start="1"/>
         </w:sectPr>
       </w:pPr>
-      <w:bookmarkStart w:colFirst="0" w:colLast="0" w:name="_u6o63hj25vbu" w:id="0"/>
+      <w:bookmarkStart w:colFirst="0" w:colLast="0" w:name="_an46wgnfqdco" w:id="0"/>
       <w:bookmarkEnd w:id="0"/>
       <w:r>
         <w:rPr>
@@ -97,19 +97,89 @@
         <w:rPr>
           <w:rtl w:val="0"/>
         </w:rPr>
-        <w:t xml:space="preserve">Large Language Models (LLMs) represent a disruptive innovation in programming education, acting as both a supportive tutor and a tool for cognitive offloading. This study investigated how specific student engagement patterns influence learning performance and computational literacy. Utilizing a multi-method design, interaction LLM trace data from an introductory Python course were categorized into adaptive (learning) and maladaptive (task-completion) help-seeking behaviors. Quantitative analysis revealed a mutual suppression effect: aggregate AI usage volume was an unreliable predictor of success, whereas engagement type was highly significant.</w:t>
-      </w:r>
-    </w:p>
-    <w:p>
-      <w:pPr>
-        <w:spacing w:after="240" w:before="240" w:line="480" w:lineRule="auto"/>
-        <w:rPr/>
-      </w:pPr>
-      <w:r>
-        <w:rPr>
-          <w:rtl w:val="0"/>
-        </w:rPr>
-        <w:t xml:space="preserve">Findings indicated that task-completion behaviors negatively predicted midterm exam scores and computational literacy gains. Conversely, learning-oriented sessions positively correlated with exam performance. Furthermore, a randomized controlled trial demonstrated that context-aware AI significantly improved learning outcomes when controlling for usage patterns, acting as a performance multiplier. These results underscore an urgent need for pedagogical adaptation, shifting from policing AI to empowering students as sophisticated, adaptive, and metacognitively aware users of generative technology.</w:t>
+        <w:t xml:space="preserve">Large language models (LLMs) represent a disruptive innovation in programming education, acting as both a supportive tutor and a mechanism for cognitive offloading. This multi-method study investigated how specific student engagement patterns with a custom, course-provided LLM chatbot influenced learning performance and computational literacy among novice programmers (</w:t>
+      </w:r>
+      <w:r>
+        <w:rPr>
+          <w:i w:val="1"/>
+          <w:iCs w:val="1"/>
+          <w:rtl w:val="0"/>
+        </w:rPr>
+        <w:t xml:space="preserve">N </w:t>
+      </w:r>
+      <w:r>
+        <w:rPr>
+          <w:rtl w:val="0"/>
+        </w:rPr>
+        <w:t xml:space="preserve">= 87).  Through categorical content analysis of 1,024 chatbot interaction sessions, student behaviors were classified into adaptive (learning-oriented) and maladaptive (task-completion) help-seeking strategies. Quantitative analysis revealed a mutual suppression effect, demonstrating that while aggregate usage volume was an unreliable predictor of success, the </w:t>
+      </w:r>
+      <w:r>
+        <w:rPr>
+          <w:i w:val="1"/>
+          <w:iCs w:val="1"/>
+          <w:rtl w:val="0"/>
+        </w:rPr>
+        <w:t xml:space="preserve">type</w:t>
+      </w:r>
+      <w:r>
+        <w:rPr>
+          <w:rtl w:val="0"/>
+        </w:rPr>
+        <w:t xml:space="preserve"> of engagement was highly significant. Findings indicated that task-completion behaviors negatively predicted midterm exam scores and computational literacy gains, whereas learning-oriented sessions positively correlated with exam performance. Additionally, a randomized controlled trial (</w:t>
+      </w:r>
+      <w:r>
+        <w:rPr>
+          <w:i w:val="1"/>
+          <w:iCs w:val="1"/>
+          <w:rtl w:val="0"/>
+        </w:rPr>
+        <w:t xml:space="preserve">n </w:t>
+      </w:r>
+      <w:r>
+        <w:rPr>
+          <w:i w:val="1"/>
+          <w:iCs w:val="1"/>
+          <w:vertAlign w:val="subscript"/>
+          <w:rtl w:val="0"/>
+        </w:rPr>
+        <w:t xml:space="preserve">treatment</w:t>
+      </w:r>
+      <w:r>
+        <w:rPr>
+          <w:i w:val="1"/>
+          <w:iCs w:val="1"/>
+          <w:rtl w:val="0"/>
+        </w:rPr>
+        <w:t xml:space="preserve"> =</w:t>
+      </w:r>
+      <w:r>
+        <w:rPr>
+          <w:rtl w:val="0"/>
+        </w:rPr>
+        <w:t xml:space="preserve"> 39, </w:t>
+      </w:r>
+      <w:r>
+        <w:rPr>
+          <w:i w:val="1"/>
+          <w:iCs w:val="1"/>
+          <w:rtl w:val="0"/>
+        </w:rPr>
+        <w:t xml:space="preserve">n </w:t>
+      </w:r>
+      <w:r>
+        <w:rPr>
+          <w:i w:val="1"/>
+          <w:iCs w:val="1"/>
+          <w:vertAlign w:val="subscript"/>
+          <w:rtl w:val="0"/>
+        </w:rPr>
+        <w:t xml:space="preserve">control </w:t>
+      </w:r>
+      <w:r>
+        <w:rPr>
+          <w:rtl w:val="0"/>
+        </w:rPr>
+        <w:t xml:space="preserve">= 48) demonstrated a conditional effect: a context-aware LLM significantly improved learning performance when controlling for these usage patterns, acting as a performance multiplier. Consequently, this study advocates for a pedagogical shift from managing AI access to cultivating AI literacy, ensuring students utilize generative technology as a scaffold for cognitive development rather than a substitute for it.</w:t>
       </w:r>
     </w:p>
     <w:p>
@@ -553,33 +623,19 @@
         <w:rPr>
           <w:rtl w:val="0"/>
         </w:rPr>
-        <w:t xml:space="preserve">Pursuing a Doctorate has been an adventure. Like every adventure there are highs, lows, moments of clarity, moments of confusion, moments of confidence and moments of doubt. I have grown so much as an academic these past few years, and there are many individuals to acknowledge; Those who helped with each of those moments.  </w:t>
-      </w:r>
-    </w:p>
-    <w:p>
-      <w:pPr>
-        <w:spacing w:after="240" w:before="240" w:line="480" w:lineRule="auto"/>
-        <w:rPr/>
-      </w:pPr>
-      <w:r>
-        <w:rPr>
-          <w:rtl w:val="0"/>
-        </w:rPr>
-        <w:t xml:space="preserve">I am thankful for the support of my advisors, Dr. Bei Yu, Dr. Jeffrey Stanton, and Dr. John Jordan. Each of you helped me along on this journey by sharing your wisdom and expertise. You let me </w:t>
-      </w:r>
-      <w:r>
-        <w:rPr>
-          <w:i w:val="1"/>
-          <w:iCs w:val="1"/>
-          <w:rtl w:val="0"/>
-        </w:rPr>
-        <w:t xml:space="preserve">explore</w:t>
-      </w:r>
-      <w:r>
-        <w:rPr>
-          <w:rtl w:val="0"/>
-        </w:rPr>
-        <w:t xml:space="preserve"> the phenomena I see in the classroom everyday and helped me to materialize it into this thesis.</w:t>
+        <w:t xml:space="preserve">Pursuing a doctorate has been an adventure. Like every adventure there are highs, lows, moments of clarity, moments of confusion, moments of confidence and moments of doubt. I have grown so much as an academic these past few years, and there are many individuals to acknowledge - those who helped with each of those moments. </w:t>
+      </w:r>
+    </w:p>
+    <w:p>
+      <w:pPr>
+        <w:spacing w:after="240" w:before="240" w:line="480" w:lineRule="auto"/>
+        <w:rPr/>
+      </w:pPr>
+      <w:r>
+        <w:rPr>
+          <w:rtl w:val="0"/>
+        </w:rPr>
+        <w:t xml:space="preserve">I am thankful for the support of my advisors, Dr. Bei Yu, Dr. Jeffrey Stanton, and Dr. John Jordan. Each of you helped me along on this journey by sharing your wisdom and expertise. You let me explore the phenomena I see in the classroom every day and helped me to materialize it into this thesis.</w:t>
       </w:r>
     </w:p>
     <w:p>
@@ -603,19 +659,19 @@
         <w:rPr>
           <w:rtl w:val="0"/>
         </w:rPr>
-        <w:t xml:space="preserve">I’d like to acknowledge my friends and family. While many of you don’t quite get what I’m trying to accomplish in this thesis, that didn’t stop you from lending an attentive ear.</w:t>
-      </w:r>
-    </w:p>
-    <w:p>
-      <w:pPr>
-        <w:spacing w:after="240" w:before="240" w:line="480" w:lineRule="auto"/>
-        <w:rPr/>
-      </w:pPr>
-      <w:r>
-        <w:rPr>
-          <w:rtl w:val="0"/>
-        </w:rPr>
-        <w:t xml:space="preserve">Most importantly, I would like to thank my loving wife Kim for her persistence, patience and unwavering support throughout my Doctoral journey, and my dog, Luna who is always ready to provide unconditional love.</w:t>
+        <w:t xml:space="preserve">I acknowledge my friends and family. While many of you do not quite get what I am trying to accomplish in this thesis, that did not stop you from lending an attentive ear.</w:t>
+      </w:r>
+    </w:p>
+    <w:p>
+      <w:pPr>
+        <w:spacing w:after="240" w:before="240" w:line="480" w:lineRule="auto"/>
+        <w:rPr/>
+      </w:pPr>
+      <w:r>
+        <w:rPr>
+          <w:rtl w:val="0"/>
+        </w:rPr>
+        <w:t xml:space="preserve">Most importantly, I thank my loving wife Kim for her persistence, patience, and unwavering support throughout my doctoral journey. Thanks to my sons Dominick and Jackson for their many distractions, and thanks to my dog Luna who was always ready to provide unconditional love.</w:t>
       </w:r>
     </w:p>
     <w:p>
@@ -665,7 +721,7 @@
     </w:p>
     <w:sdt>
       <w:sdtPr>
-        <w:id w:val="1316435545"/>
+        <w:id w:val="1011578615"/>
         <w:docPartObj>
           <w:docPartGallery w:val="Table of Contents"/>
           <w:docPartUnique w:val="1"/>
@@ -10325,12 +10381,12 @@
           <wp:inline distB="114300" distT="114300" distL="114300" distR="114300">
             <wp:extent cx="5943600" cy="3009900"/>
             <wp:effectExtent b="0" l="0" r="0" t="0"/>
-            <wp:docPr descr="A diagram of the study design" id="14" name="image17.png"/>
+            <wp:docPr descr="A diagram of the study design" id="5" name="image6.png"/>
             <a:graphic>
               <a:graphicData uri="http://schemas.openxmlformats.org/drawingml/2006/picture">
                 <pic:pic>
                   <pic:nvPicPr>
-                    <pic:cNvPr descr="A diagram of the study design" id="0" name="image17.png"/>
+                    <pic:cNvPr descr="A diagram of the study design" id="0" name="image6.png"/>
                     <pic:cNvPicPr preferRelativeResize="0"/>
                   </pic:nvPicPr>
                   <pic:blipFill>
@@ -11706,12 +11762,12 @@
           <wp:inline distB="114300" distT="114300" distL="114300" distR="114300">
             <wp:extent cx="4657725" cy="5133975"/>
             <wp:effectExtent b="0" l="0" r="0" t="0"/>
-            <wp:docPr id="20" name="image13.png"/>
+            <wp:docPr id="20" name="image16.png"/>
             <a:graphic>
               <a:graphicData uri="http://schemas.openxmlformats.org/drawingml/2006/picture">
                 <pic:pic>
                   <pic:nvPicPr>
-                    <pic:cNvPr id="0" name="image13.png"/>
+                    <pic:cNvPr id="0" name="image16.png"/>
                     <pic:cNvPicPr preferRelativeResize="0"/>
                   </pic:nvPicPr>
                   <pic:blipFill>
@@ -11771,12 +11827,12 @@
           <wp:inline distB="114300" distT="114300" distL="114300" distR="114300">
             <wp:extent cx="5943600" cy="3657600"/>
             <wp:effectExtent b="0" l="0" r="0" t="0"/>
-            <wp:docPr id="12" name="image12.png"/>
+            <wp:docPr id="3" name="image4.png"/>
             <a:graphic>
               <a:graphicData uri="http://schemas.openxmlformats.org/drawingml/2006/picture">
                 <pic:pic>
                   <pic:nvPicPr>
-                    <pic:cNvPr id="0" name="image12.png"/>
+                    <pic:cNvPr id="0" name="image4.png"/>
                     <pic:cNvPicPr preferRelativeResize="0"/>
                   </pic:nvPicPr>
                   <pic:blipFill>
@@ -11980,12 +12036,12 @@
           <wp:inline distB="114300" distT="114300" distL="114300" distR="114300">
             <wp:extent cx="5943600" cy="3276600"/>
             <wp:effectExtent b="0" l="0" r="0" t="0"/>
-            <wp:docPr id="13" name="image18.png"/>
+            <wp:docPr id="12" name="image9.png"/>
             <a:graphic>
               <a:graphicData uri="http://schemas.openxmlformats.org/drawingml/2006/picture">
                 <pic:pic>
                   <pic:nvPicPr>
-                    <pic:cNvPr id="0" name="image18.png"/>
+                    <pic:cNvPr id="0" name="image9.png"/>
                     <pic:cNvPicPr preferRelativeResize="0"/>
                   </pic:nvPicPr>
                   <pic:blipFill>
@@ -12070,12 +12126,12 @@
           <wp:inline distB="114300" distT="114300" distL="114300" distR="114300">
             <wp:extent cx="5943600" cy="2794000"/>
             <wp:effectExtent b="0" l="0" r="0" t="0"/>
-            <wp:docPr id="16" name="image6.png"/>
+            <wp:docPr id="9" name="image7.png"/>
             <a:graphic>
               <a:graphicData uri="http://schemas.openxmlformats.org/drawingml/2006/picture">
                 <pic:pic>
                   <pic:nvPicPr>
-                    <pic:cNvPr id="0" name="image6.png"/>
+                    <pic:cNvPr id="0" name="image7.png"/>
                     <pic:cNvPicPr preferRelativeResize="0"/>
                   </pic:nvPicPr>
                   <pic:blipFill>
@@ -12242,12 +12298,12 @@
           <wp:inline distB="114300" distT="114300" distL="114300" distR="114300">
             <wp:extent cx="5943600" cy="2895600"/>
             <wp:effectExtent b="0" l="0" r="0" t="0"/>
-            <wp:docPr id="5" name="image14.png"/>
+            <wp:docPr id="21" name="image20.png"/>
             <a:graphic>
               <a:graphicData uri="http://schemas.openxmlformats.org/drawingml/2006/picture">
                 <pic:pic>
                   <pic:nvPicPr>
-                    <pic:cNvPr id="0" name="image14.png"/>
+                    <pic:cNvPr id="0" name="image20.png"/>
                     <pic:cNvPicPr preferRelativeResize="0"/>
                   </pic:nvPicPr>
                   <pic:blipFill>
@@ -12681,12 +12737,12 @@
           <wp:inline distB="114300" distT="114300" distL="114300" distR="114300">
             <wp:extent cx="5943600" cy="1828800"/>
             <wp:effectExtent b="0" l="0" r="0" t="0"/>
-            <wp:docPr id="3" name="image9.png"/>
+            <wp:docPr id="23" name="image24.png"/>
             <a:graphic>
               <a:graphicData uri="http://schemas.openxmlformats.org/drawingml/2006/picture">
                 <pic:pic>
                   <pic:nvPicPr>
-                    <pic:cNvPr id="0" name="image9.png"/>
+                    <pic:cNvPr id="0" name="image24.png"/>
                     <pic:cNvPicPr preferRelativeResize="0"/>
                   </pic:nvPicPr>
                   <pic:blipFill>
@@ -12802,12 +12858,12 @@
           <wp:inline distB="114300" distT="114300" distL="114300" distR="114300">
             <wp:extent cx="5943600" cy="1231900"/>
             <wp:effectExtent b="0" l="0" r="0" t="0"/>
-            <wp:docPr descr="A black screen with white text&#10;&#10;AI-generated content may be incorrect." id="10" name="image5.jpg"/>
+            <wp:docPr descr="A black screen with white text&#10;&#10;AI-generated content may be incorrect." id="18" name="image18.jpg"/>
             <a:graphic>
               <a:graphicData uri="http://schemas.openxmlformats.org/drawingml/2006/picture">
                 <pic:pic>
                   <pic:nvPicPr>
-                    <pic:cNvPr descr="A black screen with white text&#10;&#10;AI-generated content may be incorrect." id="0" name="image5.jpg"/>
+                    <pic:cNvPr descr="A black screen with white text&#10;&#10;AI-generated content may be incorrect." id="0" name="image18.jpg"/>
                     <pic:cNvPicPr preferRelativeResize="0"/>
                   </pic:nvPicPr>
                   <pic:blipFill>
@@ -12877,12 +12933,12 @@
           <wp:inline distB="114300" distT="114300" distL="114300" distR="114300">
             <wp:extent cx="5943600" cy="1244600"/>
             <wp:effectExtent b="0" l="0" r="0" t="0"/>
-            <wp:docPr descr="A black background with white text&#10;&#10;AI-generated content may be incorrect." id="1" name="image4.jpg"/>
+            <wp:docPr descr="A black background with white text&#10;&#10;AI-generated content may be incorrect." id="10" name="image22.jpg"/>
             <a:graphic>
               <a:graphicData uri="http://schemas.openxmlformats.org/drawingml/2006/picture">
                 <pic:pic>
                   <pic:nvPicPr>
-                    <pic:cNvPr descr="A black background with white text&#10;&#10;AI-generated content may be incorrect." id="0" name="image4.jpg"/>
+                    <pic:cNvPr descr="A black background with white text&#10;&#10;AI-generated content may be incorrect." id="0" name="image22.jpg"/>
                     <pic:cNvPicPr preferRelativeResize="0"/>
                   </pic:nvPicPr>
                   <pic:blipFill>
@@ -16945,12 +17001,12 @@
           <wp:inline distB="114300" distT="114300" distL="114300" distR="114300">
             <wp:extent cx="4786313" cy="3566272"/>
             <wp:effectExtent b="0" l="0" r="0" t="0"/>
-            <wp:docPr id="22" name="image23.png"/>
+            <wp:docPr id="19" name="image19.png"/>
             <a:graphic>
               <a:graphicData uri="http://schemas.openxmlformats.org/drawingml/2006/picture">
                 <pic:pic>
                   <pic:nvPicPr>
-                    <pic:cNvPr id="0" name="image23.png"/>
+                    <pic:cNvPr id="0" name="image19.png"/>
                     <pic:cNvPicPr preferRelativeResize="0"/>
                   </pic:nvPicPr>
                   <pic:blipFill>
@@ -19866,12 +19922,12 @@
           <wp:inline distB="114300" distT="114300" distL="114300" distR="114300">
             <wp:extent cx="5943600" cy="4102100"/>
             <wp:effectExtent b="0" l="0" r="0" t="0"/>
-            <wp:docPr id="15" name="image22.png"/>
+            <wp:docPr id="2" name="image1.png"/>
             <a:graphic>
               <a:graphicData uri="http://schemas.openxmlformats.org/drawingml/2006/picture">
                 <pic:pic>
                   <pic:nvPicPr>
-                    <pic:cNvPr id="0" name="image22.png"/>
+                    <pic:cNvPr id="0" name="image1.png"/>
                     <pic:cNvPicPr preferRelativeResize="0"/>
                   </pic:nvPicPr>
                   <pic:blipFill>
@@ -19985,12 +20041,12 @@
           <wp:inline distB="114300" distT="114300" distL="114300" distR="114300">
             <wp:extent cx="4781550" cy="3171825"/>
             <wp:effectExtent b="0" l="0" r="0" t="0"/>
-            <wp:docPr id="23" name="image8.png"/>
+            <wp:docPr id="16" name="image12.png"/>
             <a:graphic>
               <a:graphicData uri="http://schemas.openxmlformats.org/drawingml/2006/picture">
                 <pic:pic>
                   <pic:nvPicPr>
-                    <pic:cNvPr id="0" name="image8.png"/>
+                    <pic:cNvPr id="0" name="image12.png"/>
                     <pic:cNvPicPr preferRelativeResize="0"/>
                   </pic:nvPicPr>
                   <pic:blipFill>
@@ -20083,12 +20139,12 @@
           <wp:inline distB="114300" distT="114300" distL="114300" distR="114300">
             <wp:extent cx="5943600" cy="2108200"/>
             <wp:effectExtent b="0" l="0" r="0" t="0"/>
-            <wp:docPr id="7" name="image3.png"/>
+            <wp:docPr id="11" name="image23.png"/>
             <a:graphic>
               <a:graphicData uri="http://schemas.openxmlformats.org/drawingml/2006/picture">
                 <pic:pic>
                   <pic:nvPicPr>
-                    <pic:cNvPr id="0" name="image3.png"/>
+                    <pic:cNvPr id="0" name="image23.png"/>
                     <pic:cNvPicPr preferRelativeResize="0"/>
                   </pic:nvPicPr>
                   <pic:blipFill>
@@ -20585,12 +20641,12 @@
           <wp:inline distB="114300" distT="114300" distL="114300" distR="114300">
             <wp:extent cx="5943600" cy="3771900"/>
             <wp:effectExtent b="0" l="0" r="0" t="0"/>
-            <wp:docPr id="2" name="image2.png"/>
+            <wp:docPr id="13" name="image10.png"/>
             <a:graphic>
               <a:graphicData uri="http://schemas.openxmlformats.org/drawingml/2006/picture">
                 <pic:pic>
                   <pic:nvPicPr>
-                    <pic:cNvPr id="0" name="image2.png"/>
+                    <pic:cNvPr id="0" name="image10.png"/>
                     <pic:cNvPicPr preferRelativeResize="0"/>
                   </pic:nvPicPr>
                   <pic:blipFill>
@@ -20927,12 +20983,12 @@
           <wp:inline distB="114300" distT="114300" distL="114300" distR="114300">
             <wp:extent cx="5943600" cy="3327400"/>
             <wp:effectExtent b="0" l="0" r="0" t="0"/>
-            <wp:docPr id="4" name="image7.png"/>
+            <wp:docPr id="17" name="image13.png"/>
             <a:graphic>
               <a:graphicData uri="http://schemas.openxmlformats.org/drawingml/2006/picture">
                 <pic:pic>
                   <pic:nvPicPr>
-                    <pic:cNvPr id="0" name="image7.png"/>
+                    <pic:cNvPr id="0" name="image13.png"/>
                     <pic:cNvPicPr preferRelativeResize="0"/>
                   </pic:nvPicPr>
                   <pic:blipFill>
@@ -21232,12 +21288,12 @@
           <wp:inline distB="114300" distT="114300" distL="114300" distR="114300">
             <wp:extent cx="5943600" cy="3517900"/>
             <wp:effectExtent b="0" l="0" r="0" t="0"/>
-            <wp:docPr id="6" name="image1.png"/>
+            <wp:docPr id="24" name="image17.png"/>
             <a:graphic>
               <a:graphicData uri="http://schemas.openxmlformats.org/drawingml/2006/picture">
                 <pic:pic>
                   <pic:nvPicPr>
-                    <pic:cNvPr id="0" name="image1.png"/>
+                    <pic:cNvPr id="0" name="image17.png"/>
                     <pic:cNvPicPr preferRelativeResize="0"/>
                   </pic:nvPicPr>
                   <pic:blipFill>
@@ -21730,12 +21786,12 @@
           <wp:inline distB="114300" distT="114300" distL="114300" distR="114300">
             <wp:extent cx="5943600" cy="3327400"/>
             <wp:effectExtent b="0" l="0" r="0" t="0"/>
-            <wp:docPr id="8" name="image19.png"/>
+            <wp:docPr id="8" name="image8.png"/>
             <a:graphic>
               <a:graphicData uri="http://schemas.openxmlformats.org/drawingml/2006/picture">
                 <pic:pic>
                   <pic:nvPicPr>
-                    <pic:cNvPr id="0" name="image19.png"/>
+                    <pic:cNvPr id="0" name="image8.png"/>
                     <pic:cNvPicPr preferRelativeResize="0"/>
                   </pic:nvPicPr>
                   <pic:blipFill>
@@ -23250,12 +23306,12 @@
           <wp:inline distB="114300" distT="114300" distL="114300" distR="114300">
             <wp:extent cx="5943600" cy="2108200"/>
             <wp:effectExtent b="0" l="0" r="0" t="0"/>
-            <wp:docPr id="24" name="image16.png"/>
+            <wp:docPr id="7" name="image15.png"/>
             <a:graphic>
               <a:graphicData uri="http://schemas.openxmlformats.org/drawingml/2006/picture">
                 <pic:pic>
                   <pic:nvPicPr>
-                    <pic:cNvPr id="0" name="image16.png"/>
+                    <pic:cNvPr id="0" name="image15.png"/>
                     <pic:cNvPicPr preferRelativeResize="0"/>
                   </pic:nvPicPr>
                   <pic:blipFill>
@@ -23500,12 +23556,12 @@
           <wp:inline distB="114300" distT="114300" distL="114300" distR="114300">
             <wp:extent cx="5943600" cy="3632200"/>
             <wp:effectExtent b="0" l="0" r="0" t="0"/>
-            <wp:docPr id="21" name="image24.png"/>
+            <wp:docPr id="22" name="image21.png"/>
             <a:graphic>
               <a:graphicData uri="http://schemas.openxmlformats.org/drawingml/2006/picture">
                 <pic:pic>
                   <pic:nvPicPr>
-                    <pic:cNvPr id="0" name="image24.png"/>
+                    <pic:cNvPr id="0" name="image21.png"/>
                     <pic:cNvPicPr preferRelativeResize="0"/>
                   </pic:nvPicPr>
                   <pic:blipFill>
@@ -25169,12 +25225,12 @@
           <wp:inline distB="114300" distT="114300" distL="114300" distR="114300">
             <wp:extent cx="5943600" cy="3276600"/>
             <wp:effectExtent b="0" l="0" r="0" t="0"/>
-            <wp:docPr id="17" name="image10.png"/>
+            <wp:docPr id="1" name="image2.png"/>
             <a:graphic>
               <a:graphicData uri="http://schemas.openxmlformats.org/drawingml/2006/picture">
                 <pic:pic>
                   <pic:nvPicPr>
-                    <pic:cNvPr id="0" name="image10.png"/>
+                    <pic:cNvPr id="0" name="image2.png"/>
                     <pic:cNvPicPr preferRelativeResize="0"/>
                   </pic:nvPicPr>
                   <pic:blipFill>
@@ -26571,12 +26627,12 @@
           <wp:inline distB="114300" distT="114300" distL="114300" distR="114300">
             <wp:extent cx="5943600" cy="4102100"/>
             <wp:effectExtent b="0" l="0" r="0" t="0"/>
-            <wp:docPr id="11" name="image15.png"/>
+            <wp:docPr id="14" name="image11.png"/>
             <a:graphic>
               <a:graphicData uri="http://schemas.openxmlformats.org/drawingml/2006/picture">
                 <pic:pic>
                   <pic:nvPicPr>
-                    <pic:cNvPr id="0" name="image15.png"/>
+                    <pic:cNvPr id="0" name="image11.png"/>
                     <pic:cNvPicPr preferRelativeResize="0"/>
                   </pic:nvPicPr>
                   <pic:blipFill>
@@ -26661,12 +26717,12 @@
           <wp:inline distB="114300" distT="114300" distL="114300" distR="114300">
             <wp:extent cx="4724400" cy="3171825"/>
             <wp:effectExtent b="0" l="0" r="0" t="0"/>
-            <wp:docPr id="9" name="image11.png"/>
+            <wp:docPr id="15" name="image14.png"/>
             <a:graphic>
               <a:graphicData uri="http://schemas.openxmlformats.org/drawingml/2006/picture">
                 <pic:pic>
                   <pic:nvPicPr>
-                    <pic:cNvPr id="0" name="image11.png"/>
+                    <pic:cNvPr id="0" name="image14.png"/>
                     <pic:cNvPicPr preferRelativeResize="0"/>
                   </pic:nvPicPr>
                   <pic:blipFill>
@@ -26778,12 +26834,12 @@
           <wp:inline distB="114300" distT="114300" distL="114300" distR="114300">
             <wp:extent cx="5943600" cy="2082800"/>
             <wp:effectExtent b="0" l="0" r="0" t="0"/>
-            <wp:docPr id="19" name="image21.png"/>
+            <wp:docPr id="6" name="image5.png"/>
             <a:graphic>
               <a:graphicData uri="http://schemas.openxmlformats.org/drawingml/2006/picture">
                 <pic:pic>
                   <pic:nvPicPr>
-                    <pic:cNvPr id="0" name="image21.png"/>
+                    <pic:cNvPr id="0" name="image5.png"/>
                     <pic:cNvPicPr preferRelativeResize="0"/>
                   </pic:nvPicPr>
                   <pic:blipFill>
@@ -27415,12 +27471,12 @@
           <wp:inline distB="114300" distT="114300" distL="114300" distR="114300">
             <wp:extent cx="5943600" cy="3289300"/>
             <wp:effectExtent b="0" l="0" r="0" t="0"/>
-            <wp:docPr id="18" name="image20.png"/>
+            <wp:docPr id="4" name="image3.png"/>
             <a:graphic>
               <a:graphicData uri="http://schemas.openxmlformats.org/drawingml/2006/picture">
                 <pic:pic>
                   <pic:nvPicPr>
-                    <pic:cNvPr id="0" name="image20.png"/>
+                    <pic:cNvPr id="0" name="image3.png"/>
                     <pic:cNvPicPr preferRelativeResize="0"/>
                   </pic:nvPicPr>
                   <pic:blipFill>

</xml_diff>